<commit_message>
Fix BAPP II: enlarge signature space, drop usaha besar section, fix item 4 number
- Signature blocks ("PIHAK KEDUA," / "PIHAK PERTAMA,") only had 1 blank
  line before the name - not enough room to physically sign. Now 5.
- Removed the entire second lampiran section ("usaha besar" - target/
  realisasi/nilai table, bukti pencapaian, screenshot) that Termin 1's
  template doesn't have; page count now matches Termin 1 (4 pages).
- Point 4 in the letter body ("...sejumlah X SLS/Sub-SLS") used
  realisasi_sls, giving a different number than point 1's target_sls for
  the same assignment - both now show target_sls, per user's request that
  they read as the same figure.

Co-Authored-By: Claude Sonnet 5 <noreply@anthropic.com>
</commit_message>
<xml_diff>
--- a/static/templates-se2026/bapp_termin2_pcl_se2026.docx
+++ b/static/templates-se2026/bapp_termin2_pcl_se2026.docx
@@ -829,7 +829,7 @@
           <w:szCs w:val="24"/>
           <w:rtl w:val="0"/>
         </w:rPr>
-        <w:t>Hasil pekerjaan Pendataan Lapangan Sensus Ekonomi 2026 sebagaimana dimaksud dalam angka 3, berupa dokumen hasil Pendataan Lapangan Sensus Ekonomi 2026, sejumlah ${realisasi_sls} SLS/Sub-SLS dan/atau usaha besar</w:t>
+        <w:t>Hasil pekerjaan Pendataan Lapangan Sensus Ekonomi 2026 sebagaimana dimaksud dalam angka 3, berupa dokumen hasil Pendataan Lapangan Sensus Ekonomi 2026, sejumlah ${target_sls} SLS/Sub-SLS dan/atau usaha besar</w:t>
       </w:r>
       <w:r>
         <w:rPr>
@@ -1067,6 +1067,51 @@
           </w:p>
           <w:p>
             <w:pPr>
+              <w:spacing w:after="240" w:line="240" w:lineRule="auto"/>
+              <w:rPr>
+                <w:rFonts w:ascii="Times New Roman" w:cs="Times New Roman" w:eastAsia="Times New Roman" w:hAnsi="Times New Roman"/>
+                <w:sz w:val="24"/>
+                <w:szCs w:val="24"/>
+              </w:rPr>
+            </w:pPr>
+            <w:r>
+              <w:rPr>
+                <w:rtl w:val="0"/>
+              </w:rPr>
+            </w:r>
+          </w:p>
+          <w:p>
+            <w:pPr>
+              <w:spacing w:after="240" w:line="240" w:lineRule="auto"/>
+              <w:rPr>
+                <w:rFonts w:ascii="Times New Roman" w:cs="Times New Roman" w:eastAsia="Times New Roman" w:hAnsi="Times New Roman"/>
+                <w:sz w:val="24"/>
+                <w:szCs w:val="24"/>
+              </w:rPr>
+            </w:pPr>
+            <w:r>
+              <w:rPr>
+                <w:rtl w:val="0"/>
+              </w:rPr>
+            </w:r>
+          </w:p>
+          <w:p>
+            <w:pPr>
+              <w:spacing w:after="240" w:line="240" w:lineRule="auto"/>
+              <w:rPr>
+                <w:rFonts w:ascii="Times New Roman" w:cs="Times New Roman" w:eastAsia="Times New Roman" w:hAnsi="Times New Roman"/>
+                <w:sz w:val="24"/>
+                <w:szCs w:val="24"/>
+              </w:rPr>
+            </w:pPr>
+            <w:r>
+              <w:rPr>
+                <w:rtl w:val="0"/>
+              </w:rPr>
+            </w:r>
+          </w:p>
+          <w:p>
+            <w:pPr>
               <w:spacing w:after="0" w:line="240" w:lineRule="auto"/>
               <w:jc w:val="center"/>
               <w:rPr>
@@ -1120,6 +1165,51 @@
               </w:rPr>
               <w:t xml:space="preserve">PIHAK PERTAMA,</w:t>
             </w:r>
+            <w:r>
+              <w:rPr>
+                <w:rtl w:val="0"/>
+              </w:rPr>
+            </w:r>
+          </w:p>
+          <w:p>
+            <w:pPr>
+              <w:spacing w:after="240" w:line="240" w:lineRule="auto"/>
+              <w:rPr>
+                <w:rFonts w:ascii="Times New Roman" w:cs="Times New Roman" w:eastAsia="Times New Roman" w:hAnsi="Times New Roman"/>
+                <w:sz w:val="24"/>
+                <w:szCs w:val="24"/>
+              </w:rPr>
+            </w:pPr>
+            <w:r>
+              <w:rPr>
+                <w:rtl w:val="0"/>
+              </w:rPr>
+            </w:r>
+          </w:p>
+          <w:p>
+            <w:pPr>
+              <w:spacing w:after="240" w:line="240" w:lineRule="auto"/>
+              <w:rPr>
+                <w:rFonts w:ascii="Times New Roman" w:cs="Times New Roman" w:eastAsia="Times New Roman" w:hAnsi="Times New Roman"/>
+                <w:sz w:val="24"/>
+                <w:szCs w:val="24"/>
+              </w:rPr>
+            </w:pPr>
+            <w:r>
+              <w:rPr>
+                <w:rtl w:val="0"/>
+              </w:rPr>
+            </w:r>
+          </w:p>
+          <w:p>
+            <w:pPr>
+              <w:spacing w:after="240" w:line="240" w:lineRule="auto"/>
+              <w:rPr>
+                <w:rFonts w:ascii="Times New Roman" w:cs="Times New Roman" w:eastAsia="Times New Roman" w:hAnsi="Times New Roman"/>
+                <w:sz w:val="24"/>
+                <w:szCs w:val="24"/>
+              </w:rPr>
+            </w:pPr>
             <w:r>
               <w:rPr>
                 <w:rtl w:val="0"/>
@@ -2887,6 +2977,54 @@
             <w:pPr>
               <w:widowControl w:val="0"/>
               <w:spacing w:after="0" w:line="240" w:lineRule="auto"/>
+              <w:rPr>
+                <w:rFonts w:ascii="Bookman Old Style" w:cs="Bookman Old Style" w:eastAsia="Bookman Old Style" w:hAnsi="Bookman Old Style"/>
+                <w:sz w:val="24"/>
+                <w:szCs w:val="24"/>
+              </w:rPr>
+            </w:pPr>
+            <w:r>
+              <w:rPr>
+                <w:rtl w:val="0"/>
+              </w:rPr>
+            </w:r>
+          </w:p>
+          <w:p>
+            <w:pPr>
+              <w:widowControl w:val="0"/>
+              <w:spacing w:after="0" w:line="240" w:lineRule="auto"/>
+              <w:rPr>
+                <w:rFonts w:ascii="Bookman Old Style" w:cs="Bookman Old Style" w:eastAsia="Bookman Old Style" w:hAnsi="Bookman Old Style"/>
+                <w:sz w:val="24"/>
+                <w:szCs w:val="24"/>
+              </w:rPr>
+            </w:pPr>
+            <w:r>
+              <w:rPr>
+                <w:rtl w:val="0"/>
+              </w:rPr>
+            </w:r>
+          </w:p>
+          <w:p>
+            <w:pPr>
+              <w:widowControl w:val="0"/>
+              <w:spacing w:after="0" w:line="240" w:lineRule="auto"/>
+              <w:rPr>
+                <w:rFonts w:ascii="Bookman Old Style" w:cs="Bookman Old Style" w:eastAsia="Bookman Old Style" w:hAnsi="Bookman Old Style"/>
+                <w:sz w:val="24"/>
+                <w:szCs w:val="24"/>
+              </w:rPr>
+            </w:pPr>
+            <w:r>
+              <w:rPr>
+                <w:rtl w:val="0"/>
+              </w:rPr>
+            </w:r>
+          </w:p>
+          <w:p>
+            <w:pPr>
+              <w:widowControl w:val="0"/>
+              <w:spacing w:after="0" w:line="240" w:lineRule="auto"/>
               <w:jc w:val="center"/>
               <w:rPr>
                 <w:rFonts w:ascii="Bookman Old Style" w:cs="Bookman Old Style" w:eastAsia="Bookman Old Style" w:hAnsi="Bookman Old Style"/>
@@ -3006,7 +3144,38 @@
             <w:pPr>
               <w:widowControl w:val="0"/>
               <w:spacing w:after="0" w:line="240" w:lineRule="auto"/>
-              <w:jc w:val="center"/>
+              <w:rPr>
+                <w:rFonts w:ascii="Bookman Old Style" w:cs="Bookman Old Style" w:eastAsia="Bookman Old Style" w:hAnsi="Bookman Old Style"/>
+                <w:sz w:val="24"/>
+                <w:szCs w:val="24"/>
+              </w:rPr>
+            </w:pPr>
+            <w:r>
+              <w:rPr>
+                <w:rtl w:val="0"/>
+              </w:rPr>
+            </w:r>
+          </w:p>
+          <w:p>
+            <w:pPr>
+              <w:widowControl w:val="0"/>
+              <w:spacing w:after="0" w:line="240" w:lineRule="auto"/>
+              <w:rPr>
+                <w:rFonts w:ascii="Bookman Old Style" w:cs="Bookman Old Style" w:eastAsia="Bookman Old Style" w:hAnsi="Bookman Old Style"/>
+                <w:sz w:val="24"/>
+                <w:szCs w:val="24"/>
+              </w:rPr>
+            </w:pPr>
+            <w:r>
+              <w:rPr>
+                <w:rtl w:val="0"/>
+              </w:rPr>
+            </w:r>
+          </w:p>
+          <w:p>
+            <w:pPr>
+              <w:widowControl w:val="0"/>
+              <w:spacing w:after="0" w:line="240" w:lineRule="auto"/>
               <w:rPr>
                 <w:rFonts w:ascii="Bookman Old Style" w:cs="Bookman Old Style" w:eastAsia="Bookman Old Style" w:hAnsi="Bookman Old Style"/>
                 <w:sz w:val="24"/>
@@ -3032,6 +3201,23 @@
             </w:pPr>
             <w:r>
               <w:rPr>
+                <w:rtl w:val="0"/>
+              </w:rPr>
+            </w:r>
+          </w:p>
+          <w:p>
+            <w:pPr>
+              <w:widowControl w:val="0"/>
+              <w:spacing w:after="0" w:line="240" w:lineRule="auto"/>
+              <w:jc w:val="center"/>
+              <w:rPr>
+                <w:rFonts w:ascii="Bookman Old Style" w:cs="Bookman Old Style" w:eastAsia="Bookman Old Style" w:hAnsi="Bookman Old Style"/>
+                <w:sz w:val="24"/>
+                <w:szCs w:val="24"/>
+              </w:rPr>
+            </w:pPr>
+            <w:r>
+              <w:rPr>
                 <w:rFonts w:ascii="Bookman Old Style" w:cs="Bookman Old Style" w:eastAsia="Bookman Old Style" w:hAnsi="Bookman Old Style"/>
                 <w:sz w:val="24"/>
                 <w:szCs w:val="24"/>
@@ -3215,2451 +3401,6 @@
           <w:rtl w:val="0"/>
         </w:rPr>
         <w:t>${nama_ppk}</w:t>
-      </w:r>
-    </w:p>
-    <w:p>
-      <w:pPr>
-        <w:widowControl w:val="0"/>
-        <w:spacing w:after="0" w:line="240" w:lineRule="auto"/>
-        <w:rPr>
-          <w:rFonts w:ascii="Bookman Old Style" w:cs="Bookman Old Style" w:eastAsia="Bookman Old Style" w:hAnsi="Bookman Old Style"/>
-          <w:sz w:val="24"/>
-          <w:szCs w:val="24"/>
-        </w:rPr>
-      </w:pPr>
-      <w:r>
-        <w:rPr>
-          <w:rtl w:val="0"/>
-        </w:rPr>
-      </w:r>
-    </w:p>
-    <w:p>
-      <w:pPr>
-        <w:widowControl w:val="0"/>
-        <w:spacing w:after="0" w:line="240" w:lineRule="auto"/>
-        <w:rPr>
-          <w:rFonts w:ascii="Bookman Old Style" w:cs="Bookman Old Style" w:eastAsia="Bookman Old Style" w:hAnsi="Bookman Old Style"/>
-          <w:sz w:val="24"/>
-          <w:szCs w:val="24"/>
-        </w:rPr>
-      </w:pPr>
-      <w:r>
-        <w:rPr>
-          <w:rtl w:val="0"/>
-        </w:rPr>
-      </w:r>
-    </w:p>
-    <w:p>
-      <w:pPr>
-        <w:widowControl w:val="0"/>
-        <w:spacing w:after="0" w:line="240" w:lineRule="auto"/>
-        <w:rPr>
-          <w:rFonts w:ascii="Bookman Old Style" w:cs="Bookman Old Style" w:eastAsia="Bookman Old Style" w:hAnsi="Bookman Old Style"/>
-          <w:sz w:val="24"/>
-          <w:szCs w:val="24"/>
-        </w:rPr>
-      </w:pPr>
-      <w:r>
-        <w:rPr>
-          <w:rtl w:val="0"/>
-        </w:rPr>
-      </w:r>
-    </w:p>
-    <w:p>
-      <w:pPr>
-        <w:widowControl w:val="0"/>
-        <w:spacing w:after="0" w:line="240" w:lineRule="auto"/>
-        <w:rPr>
-          <w:rFonts w:ascii="Bookman Old Style" w:cs="Bookman Old Style" w:eastAsia="Bookman Old Style" w:hAnsi="Bookman Old Style"/>
-          <w:sz w:val="24"/>
-          <w:szCs w:val="24"/>
-        </w:rPr>
-      </w:pPr>
-      <w:r>
-        <w:rPr>
-          <w:rtl w:val="0"/>
-        </w:rPr>
-      </w:r>
-    </w:p>
-    <w:p>
-      <w:pPr>
-        <w:spacing w:after="0" w:line="240" w:lineRule="auto"/>
-        <w:ind w:left="360" w:firstLine="0"/>
-        <w:rPr>
-          <w:rFonts w:ascii="Bookman Old Style" w:cs="Bookman Old Style" w:eastAsia="Bookman Old Style" w:hAnsi="Bookman Old Style"/>
-          <w:sz w:val="24"/>
-          <w:szCs w:val="24"/>
-        </w:rPr>
-      </w:pPr>
-      <w:r>
-        <w:rPr>
-          <w:rtl w:val="0"/>
-        </w:rPr>
-      </w:r>
-    </w:p>
-    <w:p>
-      <w:pPr>
-        <w:spacing w:after="0" w:line="240" w:lineRule="auto"/>
-        <w:rPr>
-          <w:rFonts w:ascii="Times New Roman" w:cs="Times New Roman" w:eastAsia="Times New Roman" w:hAnsi="Times New Roman"/>
-          <w:sz w:val="24"/>
-          <w:szCs w:val="24"/>
-        </w:rPr>
-      </w:pPr>
-      <w:r>
-        <w:rPr>
-          <w:rFonts w:ascii="Times New Roman" w:cs="Times New Roman" w:eastAsia="Times New Roman" w:hAnsi="Times New Roman"/>
-          <w:sz w:val="24"/>
-          <w:szCs w:val="24"/>
-          <w:rtl w:val="0"/>
-        </w:rPr>
-        <w:br w:type="textWrapping"/>
-        <w:br w:type="textWrapping"/>
-      </w:r>
-    </w:p>
-    <w:p>
-      <w:pPr>
-        <w:spacing w:after="0" w:line="240" w:lineRule="auto"/>
-        <w:rPr>
-          <w:rFonts w:ascii="Times New Roman" w:cs="Times New Roman" w:eastAsia="Times New Roman" w:hAnsi="Times New Roman"/>
-          <w:sz w:val="24"/>
-          <w:szCs w:val="24"/>
-        </w:rPr>
-      </w:pPr>
-      <w:r>
-        <w:rPr>
-          <w:rFonts w:ascii="Times New Roman" w:cs="Times New Roman" w:eastAsia="Times New Roman" w:hAnsi="Times New Roman"/>
-          <w:sz w:val="24"/>
-          <w:szCs w:val="24"/>
-          <w:rtl w:val="0"/>
-        </w:rPr>
-        <w:br w:type="textWrapping"/>
-      </w:r>
-    </w:p>
-    <w:p>
-      <w:pPr>
-        <w:spacing w:after="0" w:line="240" w:lineRule="auto"/>
-        <w:rPr>
-          <w:rFonts w:ascii="Times New Roman" w:cs="Times New Roman" w:eastAsia="Times New Roman" w:hAnsi="Times New Roman"/>
-          <w:sz w:val="24"/>
-          <w:szCs w:val="24"/>
-        </w:rPr>
-      </w:pPr>
-      <w:r>
-        <w:rPr>
-          <w:rtl w:val="0"/>
-        </w:rPr>
-      </w:r>
-    </w:p>
-    <w:p>
-      <w:pPr>
-        <w:numPr>
-          <w:ilvl w:val="0"/>
-          <w:numId w:val="3"/>
-        </w:numPr>
-        <w:pBdr>
-          <w:top w:space="0" w:sz="0" w:val="nil"/>
-          <w:left w:space="0" w:sz="0" w:val="nil"/>
-          <w:bottom w:space="0" w:sz="0" w:val="nil"/>
-          <w:right w:space="0" w:sz="0" w:val="nil"/>
-          <w:between w:space="0" w:sz="0" w:val="nil"/>
-        </w:pBdr>
-        <w:spacing w:after="200" w:line="240" w:lineRule="auto"/>
-        <w:ind w:left="720" w:hanging="360"/>
-        <w:rPr>
-          <w:rFonts w:ascii="Bookman Old Style" w:cs="Bookman Old Style" w:eastAsia="Bookman Old Style" w:hAnsi="Bookman Old Style"/>
-          <w:color w:val="000000"/>
-          <w:sz w:val="24"/>
-          <w:szCs w:val="24"/>
-        </w:rPr>
-      </w:pPr>
-      <w:r>
-        <w:rPr>
-          <w:rFonts w:ascii="Bookman Old Style" w:cs="Bookman Old Style" w:eastAsia="Bookman Old Style" w:hAnsi="Bookman Old Style"/>
-          <w:color w:val="000000"/>
-          <w:sz w:val="24"/>
-          <w:szCs w:val="24"/>
-          <w:rtl w:val="0"/>
-        </w:rPr>
-        <w:t xml:space="preserve">DAFTAR URAIAN </w:t>
-      </w:r>
-      <w:r>
-        <w:rPr>
-          <w:rFonts w:ascii="Bookman Old Style" w:cs="Bookman Old Style" w:eastAsia="Bookman Old Style" w:hAnsi="Bookman Old Style"/>
-          <w:sz w:val="24"/>
-          <w:szCs w:val="24"/>
-          <w:rtl w:val="0"/>
-        </w:rPr>
-        <w:t xml:space="preserve">PEKERJAAN</w:t>
-      </w:r>
-      <w:r>
-        <w:rPr>
-          <w:rFonts w:ascii="Bookman Old Style" w:cs="Bookman Old Style" w:eastAsia="Bookman Old Style" w:hAnsi="Bookman Old Style"/>
-          <w:color w:val="000000"/>
-          <w:sz w:val="24"/>
-          <w:szCs w:val="24"/>
-          <w:rtl w:val="0"/>
-        </w:rPr>
-        <w:t xml:space="preserve">, WAKTU PENYELESAIAN, TARGET PEKERJAAN, REALISASI PEKERJAAN DAN NILAI PERJANJIAN</w:t>
-      </w:r>
-    </w:p>
-    <w:p>
-      <w:pPr>
-        <w:spacing w:after="0" w:line="240" w:lineRule="auto"/>
-        <w:rPr>
-          <w:rFonts w:ascii="Times New Roman" w:cs="Times New Roman" w:eastAsia="Times New Roman" w:hAnsi="Times New Roman"/>
-          <w:sz w:val="24"/>
-          <w:szCs w:val="24"/>
-        </w:rPr>
-      </w:pPr>
-      <w:r>
-        <w:rPr>
-          <w:rtl w:val="0"/>
-        </w:rPr>
-      </w:r>
-    </w:p>
-    <w:tbl>
-      <w:tblPr>
-        <w:tblStyle w:val="Table4"/>
-        <w:tblW w:w="12060.0" w:type="dxa"/>
-        <w:jc w:val="center"/>
-        <w:tblLayout w:type="fixed"/>
-        <w:tblLook w:val="0400"/>
-      </w:tblPr>
-      <w:tblGrid>
-        <w:gridCol w:w="3900"/>
-        <w:gridCol w:w="1800"/>
-        <w:gridCol w:w="1365"/>
-        <w:gridCol w:w="1230"/>
-        <w:gridCol w:w="1755"/>
-        <w:gridCol w:w="2010"/>
-        <w:tblGridChange w:id="0">
-          <w:tblGrid>
-            <w:gridCol w:w="3900"/>
-            <w:gridCol w:w="1800"/>
-            <w:gridCol w:w="1365"/>
-            <w:gridCol w:w="1230"/>
-            <w:gridCol w:w="1755"/>
-            <w:gridCol w:w="2010"/>
-          </w:tblGrid>
-        </w:tblGridChange>
-      </w:tblGrid>
-      <w:tr>
-        <w:trPr>
-          <w:cantSplit w:val="0"/>
-          <w:trHeight w:val="477" w:hRule="atLeast"/>
-          <w:tblHeader w:val="0"/>
-        </w:trPr>
-        <w:tc>
-          <w:tcPr>
-            <w:vMerge w:val="restart"/>
-            <w:tcBorders>
-              <w:top w:color="000000" w:space="0" w:sz="8" w:val="single"/>
-              <w:left w:color="000000" w:space="0" w:sz="8" w:val="single"/>
-              <w:bottom w:color="000000" w:space="0" w:sz="8" w:val="single"/>
-              <w:right w:color="000000" w:space="0" w:sz="8" w:val="single"/>
-            </w:tcBorders>
-            <w:vAlign w:val="center"/>
-          </w:tcPr>
-          <w:p>
-            <w:pPr>
-              <w:spacing w:after="0" w:line="240" w:lineRule="auto"/>
-              <w:jc w:val="center"/>
-              <w:rPr>
-                <w:rFonts w:ascii="Times New Roman" w:cs="Times New Roman" w:eastAsia="Times New Roman" w:hAnsi="Times New Roman"/>
-                <w:sz w:val="24"/>
-                <w:szCs w:val="24"/>
-              </w:rPr>
-            </w:pPr>
-            <w:r>
-              <w:rPr>
-                <w:rFonts w:ascii="Bookman Old Style" w:cs="Bookman Old Style" w:eastAsia="Bookman Old Style" w:hAnsi="Bookman Old Style"/>
-                <w:color w:val="000000"/>
-                <w:sz w:val="24"/>
-                <w:szCs w:val="24"/>
-                <w:rtl w:val="0"/>
-              </w:rPr>
-              <w:t xml:space="preserve">Uraian </w:t>
-            </w:r>
-            <w:r>
-              <w:rPr>
-                <w:rFonts w:ascii="Bookman Old Style" w:cs="Bookman Old Style" w:eastAsia="Bookman Old Style" w:hAnsi="Bookman Old Style"/>
-                <w:sz w:val="24"/>
-                <w:szCs w:val="24"/>
-                <w:rtl w:val="0"/>
-              </w:rPr>
-              <w:t xml:space="preserve">Pekerjaan</w:t>
-            </w:r>
-            <w:r>
-              <w:rPr>
-                <w:rtl w:val="0"/>
-              </w:rPr>
-            </w:r>
-          </w:p>
-        </w:tc>
-        <w:tc>
-          <w:tcPr>
-            <w:vMerge w:val="restart"/>
-            <w:tcBorders>
-              <w:top w:color="000000" w:space="0" w:sz="8" w:val="single"/>
-              <w:left w:color="000000" w:space="0" w:sz="8" w:val="single"/>
-              <w:bottom w:color="000000" w:space="0" w:sz="8" w:val="single"/>
-              <w:right w:color="000000" w:space="0" w:sz="8" w:val="single"/>
-            </w:tcBorders>
-            <w:vAlign w:val="center"/>
-          </w:tcPr>
-          <w:p>
-            <w:pPr>
-              <w:spacing w:after="0" w:line="240" w:lineRule="auto"/>
-              <w:jc w:val="center"/>
-              <w:rPr>
-                <w:rFonts w:ascii="Times New Roman" w:cs="Times New Roman" w:eastAsia="Times New Roman" w:hAnsi="Times New Roman"/>
-                <w:sz w:val="24"/>
-                <w:szCs w:val="24"/>
-              </w:rPr>
-            </w:pPr>
-            <w:r>
-              <w:rPr>
-                <w:rFonts w:ascii="Bookman Old Style" w:cs="Bookman Old Style" w:eastAsia="Bookman Old Style" w:hAnsi="Bookman Old Style"/>
-                <w:color w:val="000000"/>
-                <w:sz w:val="24"/>
-                <w:szCs w:val="24"/>
-                <w:rtl w:val="0"/>
-              </w:rPr>
-              <w:t xml:space="preserve">Waktu P</w:t>
-            </w:r>
-            <w:r>
-              <w:rPr>
-                <w:rFonts w:ascii="Bookman Old Style" w:cs="Bookman Old Style" w:eastAsia="Bookman Old Style" w:hAnsi="Bookman Old Style"/>
-                <w:sz w:val="24"/>
-                <w:szCs w:val="24"/>
-                <w:rtl w:val="0"/>
-              </w:rPr>
-              <w:t xml:space="preserve">enyelesaian</w:t>
-            </w:r>
-            <w:r>
-              <w:rPr>
-                <w:rtl w:val="0"/>
-              </w:rPr>
-            </w:r>
-          </w:p>
-        </w:tc>
-        <w:tc>
-          <w:tcPr>
-            <w:gridSpan w:val="2"/>
-            <w:tcBorders>
-              <w:top w:color="000000" w:space="0" w:sz="8" w:val="single"/>
-              <w:left w:color="000000" w:space="0" w:sz="8" w:val="single"/>
-              <w:bottom w:color="000000" w:space="0" w:sz="8" w:val="single"/>
-              <w:right w:color="000000" w:space="0" w:sz="8" w:val="single"/>
-            </w:tcBorders>
-            <w:vAlign w:val="center"/>
-          </w:tcPr>
-          <w:p>
-            <w:pPr>
-              <w:spacing w:after="0" w:line="240" w:lineRule="auto"/>
-              <w:jc w:val="center"/>
-              <w:rPr>
-                <w:rFonts w:ascii="Times New Roman" w:cs="Times New Roman" w:eastAsia="Times New Roman" w:hAnsi="Times New Roman"/>
-                <w:sz w:val="24"/>
-                <w:szCs w:val="24"/>
-              </w:rPr>
-            </w:pPr>
-            <w:r>
-              <w:rPr>
-                <w:rFonts w:ascii="Bookman Old Style" w:cs="Bookman Old Style" w:eastAsia="Bookman Old Style" w:hAnsi="Bookman Old Style"/>
-                <w:color w:val="000000"/>
-                <w:sz w:val="24"/>
-                <w:szCs w:val="24"/>
-                <w:rtl w:val="0"/>
-              </w:rPr>
-              <w:t xml:space="preserve">Target Pekerjaan</w:t>
-            </w:r>
-            <w:r>
-              <w:rPr>
-                <w:rtl w:val="0"/>
-              </w:rPr>
-            </w:r>
-          </w:p>
-        </w:tc>
-        <w:tc>
-          <w:tcPr>
-            <w:vMerge w:val="restart"/>
-            <w:tcBorders>
-              <w:top w:color="000000" w:space="0" w:sz="8" w:val="single"/>
-              <w:left w:color="000000" w:space="0" w:sz="8" w:val="single"/>
-              <w:bottom w:color="000000" w:space="0" w:sz="8" w:val="single"/>
-              <w:right w:color="000000" w:space="0" w:sz="8" w:val="single"/>
-            </w:tcBorders>
-            <w:vAlign w:val="center"/>
-          </w:tcPr>
-          <w:p>
-            <w:pPr>
-              <w:spacing w:after="0" w:line="240" w:lineRule="auto"/>
-              <w:jc w:val="center"/>
-              <w:rPr>
-                <w:rFonts w:ascii="Times New Roman" w:cs="Times New Roman" w:eastAsia="Times New Roman" w:hAnsi="Times New Roman"/>
-                <w:sz w:val="24"/>
-                <w:szCs w:val="24"/>
-              </w:rPr>
-            </w:pPr>
-            <w:r>
-              <w:rPr>
-                <w:rFonts w:ascii="Bookman Old Style" w:cs="Bookman Old Style" w:eastAsia="Bookman Old Style" w:hAnsi="Bookman Old Style"/>
-                <w:color w:val="000000"/>
-                <w:sz w:val="24"/>
-                <w:szCs w:val="24"/>
-                <w:rtl w:val="0"/>
-              </w:rPr>
-              <w:t xml:space="preserve">Realisasi Pekerjaan</w:t>
-            </w:r>
-            <w:r>
-              <w:rPr>
-                <w:rtl w:val="0"/>
-              </w:rPr>
-            </w:r>
-          </w:p>
-        </w:tc>
-        <w:tc>
-          <w:tcPr>
-            <w:vMerge w:val="restart"/>
-            <w:tcBorders>
-              <w:top w:color="000000" w:space="0" w:sz="8" w:val="single"/>
-              <w:left w:color="000000" w:space="0" w:sz="8" w:val="single"/>
-              <w:bottom w:color="000000" w:space="0" w:sz="8" w:val="single"/>
-              <w:right w:color="000000" w:space="0" w:sz="8" w:val="single"/>
-            </w:tcBorders>
-            <w:vAlign w:val="center"/>
-          </w:tcPr>
-          <w:p>
-            <w:pPr>
-              <w:spacing w:after="0" w:line="240" w:lineRule="auto"/>
-              <w:jc w:val="center"/>
-              <w:rPr>
-                <w:rFonts w:ascii="Times New Roman" w:cs="Times New Roman" w:eastAsia="Times New Roman" w:hAnsi="Times New Roman"/>
-                <w:sz w:val="24"/>
-                <w:szCs w:val="24"/>
-              </w:rPr>
-            </w:pPr>
-            <w:r>
-              <w:rPr>
-                <w:rFonts w:ascii="Bookman Old Style" w:cs="Bookman Old Style" w:eastAsia="Bookman Old Style" w:hAnsi="Bookman Old Style"/>
-                <w:color w:val="000000"/>
-                <w:sz w:val="24"/>
-                <w:szCs w:val="24"/>
-                <w:rtl w:val="0"/>
-              </w:rPr>
-              <w:t xml:space="preserve">Nilai Perjanjian</w:t>
-            </w:r>
-            <w:r>
-              <w:rPr>
-                <w:rtl w:val="0"/>
-              </w:rPr>
-            </w:r>
-          </w:p>
-        </w:tc>
-      </w:tr>
-      <w:tr>
-        <w:trPr>
-          <w:cantSplit w:val="0"/>
-          <w:trHeight w:val="471" w:hRule="atLeast"/>
-          <w:tblHeader w:val="0"/>
-        </w:trPr>
-        <w:tc>
-          <w:tcPr>
-            <w:vMerge w:val="continue"/>
-            <w:tcBorders>
-              <w:top w:color="000000" w:space="0" w:sz="8" w:val="single"/>
-              <w:left w:color="000000" w:space="0" w:sz="8" w:val="single"/>
-              <w:bottom w:color="000000" w:space="0" w:sz="8" w:val="single"/>
-              <w:right w:color="000000" w:space="0" w:sz="8" w:val="single"/>
-            </w:tcBorders>
-            <w:vAlign w:val="center"/>
-          </w:tcPr>
-          <w:p>
-            <w:pPr>
-              <w:keepNext w:val="0"/>
-              <w:keepLines w:val="0"/>
-              <w:pageBreakBefore w:val="0"/>
-              <w:widowControl w:val="0"/>
-              <w:pBdr>
-                <w:top w:space="0" w:sz="0" w:val="nil"/>
-                <w:left w:space="0" w:sz="0" w:val="nil"/>
-                <w:bottom w:space="0" w:sz="0" w:val="nil"/>
-                <w:right w:space="0" w:sz="0" w:val="nil"/>
-                <w:between w:space="0" w:sz="0" w:val="nil"/>
-              </w:pBdr>
-              <w:shd w:fill="auto" w:val="clear"/>
-              <w:spacing w:after="0" w:before="0" w:line="276" w:lineRule="auto"/>
-              <w:ind w:left="0" w:right="0" w:firstLine="0"/>
-              <w:jc w:val="left"/>
-              <w:rPr>
-                <w:rFonts w:ascii="Times New Roman" w:cs="Times New Roman" w:eastAsia="Times New Roman" w:hAnsi="Times New Roman"/>
-                <w:sz w:val="24"/>
-                <w:szCs w:val="24"/>
-              </w:rPr>
-            </w:pPr>
-            <w:r>
-              <w:rPr>
-                <w:rtl w:val="0"/>
-              </w:rPr>
-            </w:r>
-          </w:p>
-        </w:tc>
-        <w:tc>
-          <w:tcPr>
-            <w:vMerge w:val="continue"/>
-            <w:tcBorders>
-              <w:top w:color="000000" w:space="0" w:sz="8" w:val="single"/>
-              <w:left w:color="000000" w:space="0" w:sz="8" w:val="single"/>
-              <w:bottom w:color="000000" w:space="0" w:sz="8" w:val="single"/>
-              <w:right w:color="000000" w:space="0" w:sz="8" w:val="single"/>
-            </w:tcBorders>
-            <w:vAlign w:val="center"/>
-          </w:tcPr>
-          <w:p>
-            <w:pPr>
-              <w:keepNext w:val="0"/>
-              <w:keepLines w:val="0"/>
-              <w:pageBreakBefore w:val="0"/>
-              <w:widowControl w:val="0"/>
-              <w:pBdr>
-                <w:top w:space="0" w:sz="0" w:val="nil"/>
-                <w:left w:space="0" w:sz="0" w:val="nil"/>
-                <w:bottom w:space="0" w:sz="0" w:val="nil"/>
-                <w:right w:space="0" w:sz="0" w:val="nil"/>
-                <w:between w:space="0" w:sz="0" w:val="nil"/>
-              </w:pBdr>
-              <w:shd w:fill="auto" w:val="clear"/>
-              <w:spacing w:after="0" w:before="0" w:line="276" w:lineRule="auto"/>
-              <w:ind w:left="0" w:right="0" w:firstLine="0"/>
-              <w:jc w:val="left"/>
-              <w:rPr>
-                <w:rFonts w:ascii="Times New Roman" w:cs="Times New Roman" w:eastAsia="Times New Roman" w:hAnsi="Times New Roman"/>
-                <w:sz w:val="24"/>
-                <w:szCs w:val="24"/>
-              </w:rPr>
-            </w:pPr>
-            <w:r>
-              <w:rPr>
-                <w:rtl w:val="0"/>
-              </w:rPr>
-            </w:r>
-          </w:p>
-        </w:tc>
-        <w:tc>
-          <w:tcPr>
-            <w:tcBorders>
-              <w:top w:color="000000" w:space="0" w:sz="8" w:val="single"/>
-              <w:left w:color="000000" w:space="0" w:sz="8" w:val="single"/>
-              <w:bottom w:color="000000" w:space="0" w:sz="8" w:val="single"/>
-              <w:right w:color="000000" w:space="0" w:sz="8" w:val="single"/>
-            </w:tcBorders>
-            <w:vAlign w:val="center"/>
-          </w:tcPr>
-          <w:p>
-            <w:pPr>
-              <w:spacing w:after="0" w:line="240" w:lineRule="auto"/>
-              <w:jc w:val="center"/>
-              <w:rPr>
-                <w:rFonts w:ascii="Times New Roman" w:cs="Times New Roman" w:eastAsia="Times New Roman" w:hAnsi="Times New Roman"/>
-                <w:sz w:val="24"/>
-                <w:szCs w:val="24"/>
-              </w:rPr>
-            </w:pPr>
-            <w:r>
-              <w:rPr>
-                <w:rFonts w:ascii="Bookman Old Style" w:cs="Bookman Old Style" w:eastAsia="Bookman Old Style" w:hAnsi="Bookman Old Style"/>
-                <w:color w:val="000000"/>
-                <w:sz w:val="24"/>
-                <w:szCs w:val="24"/>
-                <w:rtl w:val="0"/>
-              </w:rPr>
-              <w:t xml:space="preserve">Presentase</w:t>
-            </w:r>
-            <w:r>
-              <w:rPr>
-                <w:rtl w:val="0"/>
-              </w:rPr>
-            </w:r>
-          </w:p>
-        </w:tc>
-        <w:tc>
-          <w:tcPr>
-            <w:tcBorders>
-              <w:top w:color="000000" w:space="0" w:sz="8" w:val="single"/>
-              <w:left w:color="000000" w:space="0" w:sz="8" w:val="single"/>
-              <w:bottom w:color="000000" w:space="0" w:sz="8" w:val="single"/>
-              <w:right w:color="000000" w:space="0" w:sz="8" w:val="single"/>
-            </w:tcBorders>
-            <w:vAlign w:val="center"/>
-          </w:tcPr>
-          <w:p>
-            <w:pPr>
-              <w:spacing w:after="0" w:line="240" w:lineRule="auto"/>
-              <w:jc w:val="center"/>
-              <w:rPr>
-                <w:rFonts w:ascii="Times New Roman" w:cs="Times New Roman" w:eastAsia="Times New Roman" w:hAnsi="Times New Roman"/>
-                <w:sz w:val="24"/>
-                <w:szCs w:val="24"/>
-              </w:rPr>
-            </w:pPr>
-            <w:r>
-              <w:rPr>
-                <w:rFonts w:ascii="Bookman Old Style" w:cs="Bookman Old Style" w:eastAsia="Bookman Old Style" w:hAnsi="Bookman Old Style"/>
-                <w:color w:val="000000"/>
-                <w:sz w:val="24"/>
-                <w:szCs w:val="24"/>
-                <w:rtl w:val="0"/>
-              </w:rPr>
-              <w:t xml:space="preserve">Volume</w:t>
-            </w:r>
-            <w:r>
-              <w:rPr>
-                <w:rtl w:val="0"/>
-              </w:rPr>
-            </w:r>
-          </w:p>
-        </w:tc>
-        <w:tc>
-          <w:tcPr>
-            <w:vMerge w:val="continue"/>
-            <w:tcBorders>
-              <w:top w:color="000000" w:space="0" w:sz="8" w:val="single"/>
-              <w:left w:color="000000" w:space="0" w:sz="8" w:val="single"/>
-              <w:bottom w:color="000000" w:space="0" w:sz="8" w:val="single"/>
-              <w:right w:color="000000" w:space="0" w:sz="8" w:val="single"/>
-            </w:tcBorders>
-            <w:vAlign w:val="center"/>
-          </w:tcPr>
-          <w:p>
-            <w:pPr>
-              <w:keepNext w:val="0"/>
-              <w:keepLines w:val="0"/>
-              <w:pageBreakBefore w:val="0"/>
-              <w:widowControl w:val="0"/>
-              <w:pBdr>
-                <w:top w:space="0" w:sz="0" w:val="nil"/>
-                <w:left w:space="0" w:sz="0" w:val="nil"/>
-                <w:bottom w:space="0" w:sz="0" w:val="nil"/>
-                <w:right w:space="0" w:sz="0" w:val="nil"/>
-                <w:between w:space="0" w:sz="0" w:val="nil"/>
-              </w:pBdr>
-              <w:shd w:fill="auto" w:val="clear"/>
-              <w:spacing w:after="0" w:before="0" w:line="276" w:lineRule="auto"/>
-              <w:ind w:left="0" w:right="0" w:firstLine="0"/>
-              <w:jc w:val="left"/>
-              <w:rPr>
-                <w:rFonts w:ascii="Times New Roman" w:cs="Times New Roman" w:eastAsia="Times New Roman" w:hAnsi="Times New Roman"/>
-                <w:sz w:val="24"/>
-                <w:szCs w:val="24"/>
-              </w:rPr>
-            </w:pPr>
-            <w:r>
-              <w:rPr>
-                <w:rtl w:val="0"/>
-              </w:rPr>
-            </w:r>
-          </w:p>
-        </w:tc>
-        <w:tc>
-          <w:tcPr>
-            <w:vMerge w:val="continue"/>
-            <w:tcBorders>
-              <w:top w:color="000000" w:space="0" w:sz="8" w:val="single"/>
-              <w:left w:color="000000" w:space="0" w:sz="8" w:val="single"/>
-              <w:bottom w:color="000000" w:space="0" w:sz="8" w:val="single"/>
-              <w:right w:color="000000" w:space="0" w:sz="8" w:val="single"/>
-            </w:tcBorders>
-            <w:vAlign w:val="center"/>
-          </w:tcPr>
-          <w:p>
-            <w:pPr>
-              <w:keepNext w:val="0"/>
-              <w:keepLines w:val="0"/>
-              <w:pageBreakBefore w:val="0"/>
-              <w:widowControl w:val="0"/>
-              <w:pBdr>
-                <w:top w:space="0" w:sz="0" w:val="nil"/>
-                <w:left w:space="0" w:sz="0" w:val="nil"/>
-                <w:bottom w:space="0" w:sz="0" w:val="nil"/>
-                <w:right w:space="0" w:sz="0" w:val="nil"/>
-                <w:between w:space="0" w:sz="0" w:val="nil"/>
-              </w:pBdr>
-              <w:shd w:fill="auto" w:val="clear"/>
-              <w:spacing w:after="0" w:before="0" w:line="276" w:lineRule="auto"/>
-              <w:ind w:left="0" w:right="0" w:firstLine="0"/>
-              <w:jc w:val="left"/>
-              <w:rPr>
-                <w:rFonts w:ascii="Times New Roman" w:cs="Times New Roman" w:eastAsia="Times New Roman" w:hAnsi="Times New Roman"/>
-                <w:sz w:val="24"/>
-                <w:szCs w:val="24"/>
-              </w:rPr>
-            </w:pPr>
-            <w:r>
-              <w:rPr>
-                <w:rtl w:val="0"/>
-              </w:rPr>
-            </w:r>
-          </w:p>
-        </w:tc>
-      </w:tr>
-      <w:tr>
-        <w:trPr>
-          <w:cantSplit w:val="0"/>
-          <w:trHeight w:val="80" w:hRule="atLeast"/>
-          <w:tblHeader w:val="0"/>
-        </w:trPr>
-        <w:tc>
-          <w:tcPr>
-            <w:tcBorders>
-              <w:top w:color="000000" w:space="0" w:sz="8" w:val="single"/>
-              <w:left w:color="000000" w:space="0" w:sz="8" w:val="single"/>
-              <w:bottom w:color="000000" w:space="0" w:sz="8" w:val="single"/>
-              <w:right w:color="000000" w:space="0" w:sz="8" w:val="single"/>
-            </w:tcBorders>
-            <w:vAlign w:val="center"/>
-          </w:tcPr>
-          <w:p>
-            <w:pPr>
-              <w:spacing w:after="0" w:line="240" w:lineRule="auto"/>
-              <w:jc w:val="center"/>
-              <w:rPr>
-                <w:rFonts w:ascii="Times New Roman" w:cs="Times New Roman" w:eastAsia="Times New Roman" w:hAnsi="Times New Roman"/>
-                <w:sz w:val="24"/>
-                <w:szCs w:val="24"/>
-              </w:rPr>
-            </w:pPr>
-            <w:r>
-              <w:rPr>
-                <w:rFonts w:ascii="Bookman Old Style" w:cs="Bookman Old Style" w:eastAsia="Bookman Old Style" w:hAnsi="Bookman Old Style"/>
-                <w:color w:val="000000"/>
-                <w:sz w:val="24"/>
-                <w:szCs w:val="24"/>
-                <w:rtl w:val="0"/>
-              </w:rPr>
-              <w:t xml:space="preserve">(1)</w:t>
-            </w:r>
-            <w:r>
-              <w:rPr>
-                <w:rtl w:val="0"/>
-              </w:rPr>
-            </w:r>
-          </w:p>
-        </w:tc>
-        <w:tc>
-          <w:tcPr>
-            <w:tcBorders>
-              <w:top w:color="000000" w:space="0" w:sz="8" w:val="single"/>
-              <w:left w:color="000000" w:space="0" w:sz="8" w:val="single"/>
-              <w:bottom w:color="000000" w:space="0" w:sz="8" w:val="single"/>
-              <w:right w:color="000000" w:space="0" w:sz="8" w:val="single"/>
-            </w:tcBorders>
-            <w:vAlign w:val="center"/>
-          </w:tcPr>
-          <w:p>
-            <w:pPr>
-              <w:spacing w:after="0" w:line="240" w:lineRule="auto"/>
-              <w:jc w:val="center"/>
-              <w:rPr>
-                <w:rFonts w:ascii="Times New Roman" w:cs="Times New Roman" w:eastAsia="Times New Roman" w:hAnsi="Times New Roman"/>
-                <w:sz w:val="24"/>
-                <w:szCs w:val="24"/>
-              </w:rPr>
-            </w:pPr>
-            <w:r>
-              <w:rPr>
-                <w:rFonts w:ascii="Bookman Old Style" w:cs="Bookman Old Style" w:eastAsia="Bookman Old Style" w:hAnsi="Bookman Old Style"/>
-                <w:color w:val="000000"/>
-                <w:sz w:val="24"/>
-                <w:szCs w:val="24"/>
-                <w:rtl w:val="0"/>
-              </w:rPr>
-              <w:t xml:space="preserve">(2)</w:t>
-            </w:r>
-            <w:r>
-              <w:rPr>
-                <w:rtl w:val="0"/>
-              </w:rPr>
-            </w:r>
-          </w:p>
-        </w:tc>
-        <w:tc>
-          <w:tcPr>
-            <w:tcBorders>
-              <w:top w:color="000000" w:space="0" w:sz="8" w:val="single"/>
-              <w:left w:color="000000" w:space="0" w:sz="8" w:val="single"/>
-              <w:bottom w:color="000000" w:space="0" w:sz="8" w:val="single"/>
-              <w:right w:color="000000" w:space="0" w:sz="8" w:val="single"/>
-            </w:tcBorders>
-            <w:vAlign w:val="center"/>
-          </w:tcPr>
-          <w:p>
-            <w:pPr>
-              <w:spacing w:after="0" w:line="240" w:lineRule="auto"/>
-              <w:jc w:val="center"/>
-              <w:rPr>
-                <w:rFonts w:ascii="Times New Roman" w:cs="Times New Roman" w:eastAsia="Times New Roman" w:hAnsi="Times New Roman"/>
-                <w:sz w:val="24"/>
-                <w:szCs w:val="24"/>
-              </w:rPr>
-            </w:pPr>
-            <w:r>
-              <w:rPr>
-                <w:rFonts w:ascii="Bookman Old Style" w:cs="Bookman Old Style" w:eastAsia="Bookman Old Style" w:hAnsi="Bookman Old Style"/>
-                <w:color w:val="000000"/>
-                <w:sz w:val="24"/>
-                <w:szCs w:val="24"/>
-                <w:rtl w:val="0"/>
-              </w:rPr>
-              <w:t xml:space="preserve">(3)</w:t>
-            </w:r>
-            <w:r>
-              <w:rPr>
-                <w:rtl w:val="0"/>
-              </w:rPr>
-            </w:r>
-          </w:p>
-        </w:tc>
-        <w:tc>
-          <w:tcPr>
-            <w:tcBorders>
-              <w:top w:color="000000" w:space="0" w:sz="8" w:val="single"/>
-              <w:left w:color="000000" w:space="0" w:sz="8" w:val="single"/>
-              <w:bottom w:color="000000" w:space="0" w:sz="8" w:val="single"/>
-              <w:right w:color="000000" w:space="0" w:sz="8" w:val="single"/>
-            </w:tcBorders>
-            <w:vAlign w:val="center"/>
-          </w:tcPr>
-          <w:p>
-            <w:pPr>
-              <w:spacing w:after="0" w:line="240" w:lineRule="auto"/>
-              <w:jc w:val="center"/>
-              <w:rPr>
-                <w:rFonts w:ascii="Times New Roman" w:cs="Times New Roman" w:eastAsia="Times New Roman" w:hAnsi="Times New Roman"/>
-                <w:sz w:val="24"/>
-                <w:szCs w:val="24"/>
-              </w:rPr>
-            </w:pPr>
-            <w:r>
-              <w:rPr>
-                <w:rFonts w:ascii="Bookman Old Style" w:cs="Bookman Old Style" w:eastAsia="Bookman Old Style" w:hAnsi="Bookman Old Style"/>
-                <w:color w:val="000000"/>
-                <w:sz w:val="24"/>
-                <w:szCs w:val="24"/>
-                <w:rtl w:val="0"/>
-              </w:rPr>
-              <w:t xml:space="preserve">(4)</w:t>
-            </w:r>
-            <w:r>
-              <w:rPr>
-                <w:rtl w:val="0"/>
-              </w:rPr>
-            </w:r>
-          </w:p>
-        </w:tc>
-        <w:tc>
-          <w:tcPr>
-            <w:tcBorders>
-              <w:top w:color="000000" w:space="0" w:sz="8" w:val="single"/>
-              <w:left w:color="000000" w:space="0" w:sz="8" w:val="single"/>
-              <w:bottom w:color="000000" w:space="0" w:sz="8" w:val="single"/>
-              <w:right w:color="000000" w:space="0" w:sz="8" w:val="single"/>
-            </w:tcBorders>
-          </w:tcPr>
-          <w:p>
-            <w:pPr>
-              <w:spacing w:after="0" w:line="240" w:lineRule="auto"/>
-              <w:jc w:val="center"/>
-              <w:rPr>
-                <w:rFonts w:ascii="Times New Roman" w:cs="Times New Roman" w:eastAsia="Times New Roman" w:hAnsi="Times New Roman"/>
-                <w:sz w:val="24"/>
-                <w:szCs w:val="24"/>
-              </w:rPr>
-            </w:pPr>
-            <w:r>
-              <w:rPr>
-                <w:rFonts w:ascii="Bookman Old Style" w:cs="Bookman Old Style" w:eastAsia="Bookman Old Style" w:hAnsi="Bookman Old Style"/>
-                <w:color w:val="000000"/>
-                <w:sz w:val="24"/>
-                <w:szCs w:val="24"/>
-                <w:rtl w:val="0"/>
-              </w:rPr>
-              <w:t xml:space="preserve">(</w:t>
-            </w:r>
-            <w:r>
-              <w:rPr>
-                <w:rFonts w:ascii="Bookman Old Style" w:cs="Bookman Old Style" w:eastAsia="Bookman Old Style" w:hAnsi="Bookman Old Style"/>
-                <w:sz w:val="24"/>
-                <w:szCs w:val="24"/>
-                <w:rtl w:val="0"/>
-              </w:rPr>
-              <w:t xml:space="preserve">5</w:t>
-            </w:r>
-            <w:r>
-              <w:rPr>
-                <w:rFonts w:ascii="Bookman Old Style" w:cs="Bookman Old Style" w:eastAsia="Bookman Old Style" w:hAnsi="Bookman Old Style"/>
-                <w:color w:val="000000"/>
-                <w:sz w:val="24"/>
-                <w:szCs w:val="24"/>
-                <w:rtl w:val="0"/>
-              </w:rPr>
-              <w:t xml:space="preserve">)</w:t>
-            </w:r>
-            <w:r>
-              <w:rPr>
-                <w:rtl w:val="0"/>
-              </w:rPr>
-            </w:r>
-          </w:p>
-        </w:tc>
-        <w:tc>
-          <w:tcPr>
-            <w:tcBorders>
-              <w:top w:color="000000" w:space="0" w:sz="8" w:val="single"/>
-              <w:left w:color="000000" w:space="0" w:sz="8" w:val="single"/>
-              <w:bottom w:color="000000" w:space="0" w:sz="8" w:val="single"/>
-              <w:right w:color="000000" w:space="0" w:sz="8" w:val="single"/>
-            </w:tcBorders>
-            <w:vAlign w:val="center"/>
-          </w:tcPr>
-          <w:p>
-            <w:pPr>
-              <w:spacing w:after="0" w:line="240" w:lineRule="auto"/>
-              <w:jc w:val="center"/>
-              <w:rPr>
-                <w:rFonts w:ascii="Times New Roman" w:cs="Times New Roman" w:eastAsia="Times New Roman" w:hAnsi="Times New Roman"/>
-                <w:sz w:val="24"/>
-                <w:szCs w:val="24"/>
-              </w:rPr>
-            </w:pPr>
-            <w:r>
-              <w:rPr>
-                <w:rFonts w:ascii="Bookman Old Style" w:cs="Bookman Old Style" w:eastAsia="Bookman Old Style" w:hAnsi="Bookman Old Style"/>
-                <w:color w:val="000000"/>
-                <w:sz w:val="24"/>
-                <w:szCs w:val="24"/>
-                <w:rtl w:val="0"/>
-              </w:rPr>
-              <w:t xml:space="preserve">(</w:t>
-            </w:r>
-            <w:r>
-              <w:rPr>
-                <w:rFonts w:ascii="Bookman Old Style" w:cs="Bookman Old Style" w:eastAsia="Bookman Old Style" w:hAnsi="Bookman Old Style"/>
-                <w:sz w:val="24"/>
-                <w:szCs w:val="24"/>
-                <w:rtl w:val="0"/>
-              </w:rPr>
-              <w:t xml:space="preserve">6</w:t>
-            </w:r>
-            <w:r>
-              <w:rPr>
-                <w:rFonts w:ascii="Bookman Old Style" w:cs="Bookman Old Style" w:eastAsia="Bookman Old Style" w:hAnsi="Bookman Old Style"/>
-                <w:color w:val="000000"/>
-                <w:sz w:val="24"/>
-                <w:szCs w:val="24"/>
-                <w:rtl w:val="0"/>
-              </w:rPr>
-              <w:t xml:space="preserve">)</w:t>
-            </w:r>
-            <w:r>
-              <w:rPr>
-                <w:rtl w:val="0"/>
-              </w:rPr>
-            </w:r>
-          </w:p>
-        </w:tc>
-      </w:tr>
-      <w:tr>
-        <w:trPr>
-          <w:cantSplit w:val="0"/>
-          <w:trHeight w:val="636" w:hRule="atLeast"/>
-          <w:tblHeader w:val="0"/>
-        </w:trPr>
-        <w:tc>
-          <w:tcPr>
-            <w:vMerge w:val="restart"/>
-            <w:tcBorders>
-              <w:top w:color="000000" w:space="0" w:sz="8" w:val="single"/>
-              <w:left w:color="000000" w:space="0" w:sz="8" w:val="single"/>
-              <w:bottom w:color="000000" w:space="0" w:sz="8" w:val="single"/>
-              <w:right w:color="000000" w:space="0" w:sz="8" w:val="single"/>
-            </w:tcBorders>
-            <w:vAlign w:val="center"/>
-          </w:tcPr>
-          <w:p>
-            <w:pPr>
-              <w:spacing w:after="0" w:line="240" w:lineRule="auto"/>
-              <w:ind w:left="720" w:firstLine="0"/>
-              <w:rPr>
-                <w:rFonts w:ascii="Bookman Old Style" w:cs="Bookman Old Style" w:eastAsia="Bookman Old Style" w:hAnsi="Bookman Old Style"/>
-                <w:color w:val="000000"/>
-                <w:sz w:val="24"/>
-                <w:szCs w:val="24"/>
-              </w:rPr>
-            </w:pPr>
-            <w:r>
-              <w:rPr>
-                <w:rFonts w:ascii="Bookman Old Style" w:cs="Bookman Old Style" w:eastAsia="Bookman Old Style" w:hAnsi="Bookman Old Style"/>
-                <w:color w:val="000000"/>
-                <w:sz w:val="24"/>
-                <w:szCs w:val="24"/>
-                <w:rtl w:val="0"/>
-              </w:rPr>
-              <w:t xml:space="preserve">Melakukan pendataan lapangan usaha besar</w:t>
-            </w:r>
-            <w:r>
-              <w:rPr>
-                <w:rFonts w:ascii="Bookman Old Style" w:cs="Bookman Old Style" w:eastAsia="Bookman Old Style" w:hAnsi="Bookman Old Style"/>
-                <w:i w:val="1"/>
-                <w:iCs w:val="1"/>
-                <w:color w:val="000000"/>
-                <w:sz w:val="24"/>
-                <w:szCs w:val="24"/>
-                <w:rtl w:val="0"/>
-              </w:rPr>
-              <w:t xml:space="preserve"> </w:t>
-            </w:r>
-            <w:r>
-              <w:rPr>
-                <w:rFonts w:ascii="Bookman Old Style" w:cs="Bookman Old Style" w:eastAsia="Bookman Old Style" w:hAnsi="Bookman Old Style"/>
-                <w:color w:val="000000"/>
-                <w:sz w:val="24"/>
-                <w:szCs w:val="24"/>
-                <w:rtl w:val="0"/>
-              </w:rPr>
-              <w:t xml:space="preserve">Sensus Ekonomi 2026</w:t>
-            </w:r>
-            <w:r>
-              <w:rPr>
-                <w:rFonts w:ascii="Bookman Old Style" w:cs="Bookman Old Style" w:eastAsia="Bookman Old Style" w:hAnsi="Bookman Old Style"/>
-                <w:i w:val="1"/>
-                <w:iCs w:val="1"/>
-                <w:color w:val="000000"/>
-                <w:sz w:val="24"/>
-                <w:szCs w:val="24"/>
-                <w:rtl w:val="0"/>
-              </w:rPr>
-              <w:t xml:space="preserve"> </w:t>
-            </w:r>
-            <w:r>
-              <w:rPr>
-                <w:rFonts w:ascii="Bookman Old Style" w:cs="Bookman Old Style" w:eastAsia="Bookman Old Style" w:hAnsi="Bookman Old Style"/>
-                <w:color w:val="000000"/>
-                <w:sz w:val="24"/>
-                <w:szCs w:val="24"/>
-                <w:rtl w:val="0"/>
-              </w:rPr>
-              <w:t xml:space="preserve">termin </w:t>
-            </w:r>
-            <w:r>
-              <w:rPr>
-                <w:rFonts w:ascii="Bookman Old Style" w:cs="Bookman Old Style" w:eastAsia="Bookman Old Style" w:hAnsi="Bookman Old Style"/>
-                <w:sz w:val="24"/>
-                <w:szCs w:val="24"/>
-                <w:rtl w:val="0"/>
-              </w:rPr>
-              <w:t xml:space="preserve">II</w:t>
-            </w:r>
-            <w:r>
-              <w:rPr>
-                <w:rtl w:val="0"/>
-              </w:rPr>
-            </w:r>
-          </w:p>
-        </w:tc>
-        <w:tc>
-          <w:tcPr>
-            <w:vMerge w:val="restart"/>
-            <w:tcBorders>
-              <w:top w:color="000000" w:space="0" w:sz="8" w:val="single"/>
-              <w:left w:color="000000" w:space="0" w:sz="8" w:val="single"/>
-              <w:bottom w:color="000000" w:space="0" w:sz="8" w:val="single"/>
-              <w:right w:color="000000" w:space="0" w:sz="8" w:val="single"/>
-            </w:tcBorders>
-            <w:vAlign w:val="center"/>
-          </w:tcPr>
-          <w:p>
-            <w:pPr>
-              <w:spacing w:after="0" w:line="240" w:lineRule="auto"/>
-              <w:jc w:val="center"/>
-              <w:rPr>
-                <w:rFonts w:ascii="Times New Roman" w:cs="Times New Roman" w:eastAsia="Times New Roman" w:hAnsi="Times New Roman"/>
-                <w:sz w:val="24"/>
-                <w:szCs w:val="24"/>
-              </w:rPr>
-            </w:pPr>
-            <w:r>
-              <w:rPr>
-                <w:rFonts w:ascii="Bookman Old Style" w:cs="Bookman Old Style" w:eastAsia="Bookman Old Style" w:hAnsi="Bookman Old Style"/>
-                <w:color w:val="000000"/>
-                <w:sz w:val="24"/>
-                <w:szCs w:val="24"/>
-                <w:rtl w:val="0"/>
-              </w:rPr>
-              <w:t xml:space="preserve">16 Juli-31 Agustus 2026</w:t>
-            </w:r>
-            <w:r>
-              <w:rPr>
-                <w:rtl w:val="0"/>
-              </w:rPr>
-            </w:r>
-          </w:p>
-          <w:p>
-            <w:pPr>
-              <w:spacing w:after="0" w:line="240" w:lineRule="auto"/>
-              <w:rPr>
-                <w:rFonts w:ascii="Times New Roman" w:cs="Times New Roman" w:eastAsia="Times New Roman" w:hAnsi="Times New Roman"/>
-                <w:sz w:val="24"/>
-                <w:szCs w:val="24"/>
-              </w:rPr>
-            </w:pPr>
-            <w:r>
-              <w:rPr>
-                <w:rtl w:val="0"/>
-              </w:rPr>
-            </w:r>
-          </w:p>
-        </w:tc>
-        <w:tc>
-          <w:tcPr>
-            <w:vMerge w:val="restart"/>
-            <w:tcBorders>
-              <w:top w:color="000000" w:space="0" w:sz="8" w:val="single"/>
-              <w:left w:color="000000" w:space="0" w:sz="8" w:val="single"/>
-              <w:bottom w:color="000000" w:space="0" w:sz="8" w:val="single"/>
-              <w:right w:color="000000" w:space="0" w:sz="8" w:val="single"/>
-            </w:tcBorders>
-            <w:vAlign w:val="center"/>
-          </w:tcPr>
-          <w:p>
-            <w:pPr>
-              <w:spacing w:after="0" w:line="240" w:lineRule="auto"/>
-              <w:jc w:val="center"/>
-              <w:rPr>
-                <w:rFonts w:ascii="Times New Roman" w:cs="Times New Roman" w:eastAsia="Times New Roman" w:hAnsi="Times New Roman"/>
-                <w:sz w:val="24"/>
-                <w:szCs w:val="24"/>
-              </w:rPr>
-            </w:pPr>
-            <w:r>
-              <w:rPr>
-                <w:rFonts w:ascii="Bookman Old Style" w:cs="Bookman Old Style" w:eastAsia="Bookman Old Style" w:hAnsi="Bookman Old Style"/>
-                <w:sz w:val="24"/>
-                <w:szCs w:val="24"/>
-                <w:rtl w:val="0"/>
-              </w:rPr>
-              <w:t xml:space="preserve">6</w:t>
-            </w:r>
-            <w:r>
-              <w:rPr>
-                <w:rFonts w:ascii="Bookman Old Style" w:cs="Bookman Old Style" w:eastAsia="Bookman Old Style" w:hAnsi="Bookman Old Style"/>
-                <w:color w:val="000000"/>
-                <w:sz w:val="24"/>
-                <w:szCs w:val="24"/>
-                <w:rtl w:val="0"/>
-              </w:rPr>
-              <w:t xml:space="preserve">0%</w:t>
-            </w:r>
-            <w:r>
-              <w:rPr>
-                <w:rtl w:val="0"/>
-              </w:rPr>
-            </w:r>
-          </w:p>
-        </w:tc>
-        <w:tc>
-          <w:tcPr>
-            <w:vMerge w:val="restart"/>
-            <w:tcBorders>
-              <w:top w:color="000000" w:space="0" w:sz="8" w:val="single"/>
-              <w:left w:color="000000" w:space="0" w:sz="8" w:val="single"/>
-              <w:bottom w:color="000000" w:space="0" w:sz="8" w:val="single"/>
-              <w:right w:color="000000" w:space="0" w:sz="8" w:val="single"/>
-            </w:tcBorders>
-            <w:vAlign w:val="center"/>
-          </w:tcPr>
-          <w:p>
-            <w:pPr>
-              <w:spacing w:after="0" w:line="240" w:lineRule="auto"/>
-              <w:jc w:val="center"/>
-              <w:rPr>
-                <w:rFonts w:ascii="Times New Roman" w:cs="Times New Roman" w:eastAsia="Times New Roman" w:hAnsi="Times New Roman"/>
-                <w:sz w:val="24"/>
-                <w:szCs w:val="24"/>
-              </w:rPr>
-            </w:pPr>
-            <w:r>
-              <w:rPr>
-                <w:rFonts w:ascii="Bookman Old Style" w:cs="Bookman Old Style" w:eastAsia="Bookman Old Style" w:hAnsi="Bookman Old Style"/>
-                <w:sz w:val="24"/>
-                <w:szCs w:val="24"/>
-                <w:rtl w:val="0"/>
-              </w:rPr>
-              <w:t xml:space="preserve">usaha besar</w:t>
-            </w:r>
-            <w:r>
-              <w:rPr>
-                <w:rtl w:val="0"/>
-              </w:rPr>
-            </w:r>
-          </w:p>
-        </w:tc>
-        <w:tc>
-          <w:tcPr>
-            <w:vMerge w:val="restart"/>
-            <w:tcBorders>
-              <w:top w:color="000000" w:space="0" w:sz="8" w:val="single"/>
-              <w:left w:color="000000" w:space="0" w:sz="8" w:val="single"/>
-              <w:bottom w:color="000000" w:space="0" w:sz="8" w:val="single"/>
-              <w:right w:color="000000" w:space="0" w:sz="8" w:val="single"/>
-            </w:tcBorders>
-            <w:vAlign w:val="center"/>
-          </w:tcPr>
-          <w:p>
-            <w:pPr>
-              <w:spacing w:after="0" w:line="240" w:lineRule="auto"/>
-              <w:jc w:val="center"/>
-              <w:rPr>
-                <w:rFonts w:ascii="Times New Roman" w:cs="Times New Roman" w:eastAsia="Times New Roman" w:hAnsi="Times New Roman"/>
-                <w:sz w:val="24"/>
-                <w:szCs w:val="24"/>
-              </w:rPr>
-            </w:pPr>
-            <w:r>
-              <w:rPr>
-                <w:rFonts w:ascii="Bookman Old Style" w:cs="Bookman Old Style" w:eastAsia="Bookman Old Style" w:hAnsi="Bookman Old Style"/>
-                <w:sz w:val="24"/>
-                <w:szCs w:val="24"/>
-                <w:rtl w:val="0"/>
-              </w:rPr>
-              <w:t>Tidak ada assignment usaha besar terpisah</w:t>
-            </w:r>
-            <w:r>
-              <w:rPr>
-                <w:rtl w:val="0"/>
-              </w:rPr>
-            </w:r>
-          </w:p>
-          <w:p>
-            <w:pPr>
-              <w:spacing w:after="0" w:line="240" w:lineRule="auto"/>
-              <w:rPr>
-                <w:rFonts w:ascii="Times New Roman" w:cs="Times New Roman" w:eastAsia="Times New Roman" w:hAnsi="Times New Roman"/>
-                <w:sz w:val="24"/>
-                <w:szCs w:val="24"/>
-              </w:rPr>
-            </w:pPr>
-            <w:r>
-              <w:rPr>
-                <w:rtl w:val="0"/>
-              </w:rPr>
-            </w:r>
-          </w:p>
-        </w:tc>
-        <w:tc>
-          <w:tcPr>
-            <w:vMerge w:val="restart"/>
-            <w:tcBorders>
-              <w:top w:color="000000" w:space="0" w:sz="8" w:val="single"/>
-              <w:left w:color="000000" w:space="0" w:sz="8" w:val="single"/>
-              <w:bottom w:color="000000" w:space="0" w:sz="8" w:val="single"/>
-              <w:right w:color="000000" w:space="0" w:sz="8" w:val="single"/>
-            </w:tcBorders>
-            <w:vAlign w:val="center"/>
-          </w:tcPr>
-          <w:p>
-            <w:pPr>
-              <w:spacing w:after="0" w:line="240" w:lineRule="auto"/>
-              <w:jc w:val="center"/>
-              <w:rPr>
-                <w:rFonts w:ascii="Times New Roman" w:cs="Times New Roman" w:eastAsia="Times New Roman" w:hAnsi="Times New Roman"/>
-                <w:sz w:val="24"/>
-                <w:szCs w:val="24"/>
-              </w:rPr>
-            </w:pPr>
-            <w:r>
-              <w:rPr>
-                <w:rFonts w:ascii="Bookman Old Style" w:cs="Bookman Old Style" w:eastAsia="Bookman Old Style" w:hAnsi="Bookman Old Style"/>
-                <w:sz w:val="24"/>
-                <w:szCs w:val="24"/>
-                <w:rtl w:val="0"/>
-              </w:rPr>
-              <w:t>Rp 0, 00</w:t>
-            </w:r>
-            <w:r>
-              <w:rPr>
-                <w:rtl w:val="0"/>
-              </w:rPr>
-            </w:r>
-          </w:p>
-        </w:tc>
-      </w:tr>
-      <w:tr>
-        <w:trPr>
-          <w:cantSplit w:val="0"/>
-          <w:trHeight w:val="636" w:hRule="atLeast"/>
-          <w:tblHeader w:val="0"/>
-        </w:trPr>
-        <w:tc>
-          <w:tcPr>
-            <w:vMerge w:val="continue"/>
-            <w:tcBorders>
-              <w:top w:color="000000" w:space="0" w:sz="8" w:val="single"/>
-              <w:left w:color="000000" w:space="0" w:sz="8" w:val="single"/>
-              <w:bottom w:color="000000" w:space="0" w:sz="8" w:val="single"/>
-              <w:right w:color="000000" w:space="0" w:sz="8" w:val="single"/>
-            </w:tcBorders>
-            <w:vAlign w:val="center"/>
-          </w:tcPr>
-          <w:p>
-            <w:pPr>
-              <w:keepNext w:val="0"/>
-              <w:keepLines w:val="0"/>
-              <w:pageBreakBefore w:val="0"/>
-              <w:widowControl w:val="0"/>
-              <w:pBdr>
-                <w:top w:space="0" w:sz="0" w:val="nil"/>
-                <w:left w:space="0" w:sz="0" w:val="nil"/>
-                <w:bottom w:space="0" w:sz="0" w:val="nil"/>
-                <w:right w:space="0" w:sz="0" w:val="nil"/>
-                <w:between w:space="0" w:sz="0" w:val="nil"/>
-              </w:pBdr>
-              <w:shd w:fill="auto" w:val="clear"/>
-              <w:spacing w:after="0" w:before="0" w:line="276" w:lineRule="auto"/>
-              <w:ind w:left="0" w:right="0" w:firstLine="0"/>
-              <w:jc w:val="left"/>
-              <w:rPr>
-                <w:rFonts w:ascii="Times New Roman" w:cs="Times New Roman" w:eastAsia="Times New Roman" w:hAnsi="Times New Roman"/>
-                <w:sz w:val="24"/>
-                <w:szCs w:val="24"/>
-              </w:rPr>
-            </w:pPr>
-            <w:r>
-              <w:rPr>
-                <w:rtl w:val="0"/>
-              </w:rPr>
-            </w:r>
-          </w:p>
-        </w:tc>
-        <w:tc>
-          <w:tcPr>
-            <w:vMerge w:val="continue"/>
-            <w:tcBorders>
-              <w:top w:color="000000" w:space="0" w:sz="8" w:val="single"/>
-              <w:left w:color="000000" w:space="0" w:sz="8" w:val="single"/>
-              <w:bottom w:color="000000" w:space="0" w:sz="8" w:val="single"/>
-              <w:right w:color="000000" w:space="0" w:sz="8" w:val="single"/>
-            </w:tcBorders>
-            <w:vAlign w:val="center"/>
-          </w:tcPr>
-          <w:p>
-            <w:pPr>
-              <w:keepNext w:val="0"/>
-              <w:keepLines w:val="0"/>
-              <w:pageBreakBefore w:val="0"/>
-              <w:widowControl w:val="0"/>
-              <w:pBdr>
-                <w:top w:space="0" w:sz="0" w:val="nil"/>
-                <w:left w:space="0" w:sz="0" w:val="nil"/>
-                <w:bottom w:space="0" w:sz="0" w:val="nil"/>
-                <w:right w:space="0" w:sz="0" w:val="nil"/>
-                <w:between w:space="0" w:sz="0" w:val="nil"/>
-              </w:pBdr>
-              <w:shd w:fill="auto" w:val="clear"/>
-              <w:spacing w:after="0" w:before="0" w:line="276" w:lineRule="auto"/>
-              <w:ind w:left="0" w:right="0" w:firstLine="0"/>
-              <w:jc w:val="left"/>
-              <w:rPr>
-                <w:rFonts w:ascii="Times New Roman" w:cs="Times New Roman" w:eastAsia="Times New Roman" w:hAnsi="Times New Roman"/>
-                <w:sz w:val="24"/>
-                <w:szCs w:val="24"/>
-              </w:rPr>
-            </w:pPr>
-            <w:r>
-              <w:rPr>
-                <w:rtl w:val="0"/>
-              </w:rPr>
-            </w:r>
-          </w:p>
-        </w:tc>
-        <w:tc>
-          <w:tcPr>
-            <w:vMerge w:val="continue"/>
-            <w:tcBorders>
-              <w:top w:color="000000" w:space="0" w:sz="8" w:val="single"/>
-              <w:left w:color="000000" w:space="0" w:sz="8" w:val="single"/>
-              <w:bottom w:color="000000" w:space="0" w:sz="8" w:val="single"/>
-              <w:right w:color="000000" w:space="0" w:sz="8" w:val="single"/>
-            </w:tcBorders>
-            <w:vAlign w:val="center"/>
-          </w:tcPr>
-          <w:p>
-            <w:pPr>
-              <w:keepNext w:val="0"/>
-              <w:keepLines w:val="0"/>
-              <w:pageBreakBefore w:val="0"/>
-              <w:widowControl w:val="0"/>
-              <w:pBdr>
-                <w:top w:space="0" w:sz="0" w:val="nil"/>
-                <w:left w:space="0" w:sz="0" w:val="nil"/>
-                <w:bottom w:space="0" w:sz="0" w:val="nil"/>
-                <w:right w:space="0" w:sz="0" w:val="nil"/>
-                <w:between w:space="0" w:sz="0" w:val="nil"/>
-              </w:pBdr>
-              <w:shd w:fill="auto" w:val="clear"/>
-              <w:spacing w:after="0" w:before="0" w:line="276" w:lineRule="auto"/>
-              <w:ind w:left="0" w:right="0" w:firstLine="0"/>
-              <w:jc w:val="left"/>
-              <w:rPr>
-                <w:rFonts w:ascii="Times New Roman" w:cs="Times New Roman" w:eastAsia="Times New Roman" w:hAnsi="Times New Roman"/>
-                <w:sz w:val="24"/>
-                <w:szCs w:val="24"/>
-              </w:rPr>
-            </w:pPr>
-            <w:r>
-              <w:rPr>
-                <w:rtl w:val="0"/>
-              </w:rPr>
-            </w:r>
-          </w:p>
-        </w:tc>
-        <w:tc>
-          <w:tcPr>
-            <w:vMerge w:val="continue"/>
-            <w:tcBorders>
-              <w:top w:color="000000" w:space="0" w:sz="8" w:val="single"/>
-              <w:left w:color="000000" w:space="0" w:sz="8" w:val="single"/>
-              <w:bottom w:color="000000" w:space="0" w:sz="8" w:val="single"/>
-              <w:right w:color="000000" w:space="0" w:sz="8" w:val="single"/>
-            </w:tcBorders>
-            <w:vAlign w:val="center"/>
-          </w:tcPr>
-          <w:p>
-            <w:pPr>
-              <w:keepNext w:val="0"/>
-              <w:keepLines w:val="0"/>
-              <w:pageBreakBefore w:val="0"/>
-              <w:widowControl w:val="0"/>
-              <w:pBdr>
-                <w:top w:space="0" w:sz="0" w:val="nil"/>
-                <w:left w:space="0" w:sz="0" w:val="nil"/>
-                <w:bottom w:space="0" w:sz="0" w:val="nil"/>
-                <w:right w:space="0" w:sz="0" w:val="nil"/>
-                <w:between w:space="0" w:sz="0" w:val="nil"/>
-              </w:pBdr>
-              <w:shd w:fill="auto" w:val="clear"/>
-              <w:spacing w:after="0" w:before="0" w:line="276" w:lineRule="auto"/>
-              <w:ind w:left="0" w:right="0" w:firstLine="0"/>
-              <w:jc w:val="left"/>
-              <w:rPr>
-                <w:rFonts w:ascii="Times New Roman" w:cs="Times New Roman" w:eastAsia="Times New Roman" w:hAnsi="Times New Roman"/>
-                <w:sz w:val="24"/>
-                <w:szCs w:val="24"/>
-              </w:rPr>
-            </w:pPr>
-            <w:r>
-              <w:rPr>
-                <w:rtl w:val="0"/>
-              </w:rPr>
-            </w:r>
-          </w:p>
-        </w:tc>
-        <w:tc>
-          <w:tcPr>
-            <w:vMerge w:val="continue"/>
-            <w:tcBorders>
-              <w:top w:color="000000" w:space="0" w:sz="8" w:val="single"/>
-              <w:left w:color="000000" w:space="0" w:sz="8" w:val="single"/>
-              <w:bottom w:color="000000" w:space="0" w:sz="8" w:val="single"/>
-              <w:right w:color="000000" w:space="0" w:sz="8" w:val="single"/>
-            </w:tcBorders>
-            <w:vAlign w:val="center"/>
-          </w:tcPr>
-          <w:p>
-            <w:pPr>
-              <w:keepNext w:val="0"/>
-              <w:keepLines w:val="0"/>
-              <w:pageBreakBefore w:val="0"/>
-              <w:widowControl w:val="0"/>
-              <w:pBdr>
-                <w:top w:space="0" w:sz="0" w:val="nil"/>
-                <w:left w:space="0" w:sz="0" w:val="nil"/>
-                <w:bottom w:space="0" w:sz="0" w:val="nil"/>
-                <w:right w:space="0" w:sz="0" w:val="nil"/>
-                <w:between w:space="0" w:sz="0" w:val="nil"/>
-              </w:pBdr>
-              <w:shd w:fill="auto" w:val="clear"/>
-              <w:spacing w:after="0" w:before="0" w:line="276" w:lineRule="auto"/>
-              <w:ind w:left="0" w:right="0" w:firstLine="0"/>
-              <w:jc w:val="left"/>
-              <w:rPr>
-                <w:rFonts w:ascii="Times New Roman" w:cs="Times New Roman" w:eastAsia="Times New Roman" w:hAnsi="Times New Roman"/>
-                <w:sz w:val="24"/>
-                <w:szCs w:val="24"/>
-              </w:rPr>
-            </w:pPr>
-            <w:r>
-              <w:rPr>
-                <w:rtl w:val="0"/>
-              </w:rPr>
-            </w:r>
-          </w:p>
-        </w:tc>
-        <w:tc>
-          <w:tcPr>
-            <w:vMerge w:val="continue"/>
-            <w:tcBorders>
-              <w:top w:color="000000" w:space="0" w:sz="8" w:val="single"/>
-              <w:left w:color="000000" w:space="0" w:sz="8" w:val="single"/>
-              <w:bottom w:color="000000" w:space="0" w:sz="8" w:val="single"/>
-              <w:right w:color="000000" w:space="0" w:sz="8" w:val="single"/>
-            </w:tcBorders>
-            <w:vAlign w:val="center"/>
-          </w:tcPr>
-          <w:p>
-            <w:pPr>
-              <w:keepNext w:val="0"/>
-              <w:keepLines w:val="0"/>
-              <w:pageBreakBefore w:val="0"/>
-              <w:widowControl w:val="0"/>
-              <w:pBdr>
-                <w:top w:space="0" w:sz="0" w:val="nil"/>
-                <w:left w:space="0" w:sz="0" w:val="nil"/>
-                <w:bottom w:space="0" w:sz="0" w:val="nil"/>
-                <w:right w:space="0" w:sz="0" w:val="nil"/>
-                <w:between w:space="0" w:sz="0" w:val="nil"/>
-              </w:pBdr>
-              <w:shd w:fill="auto" w:val="clear"/>
-              <w:spacing w:after="0" w:before="0" w:line="276" w:lineRule="auto"/>
-              <w:ind w:left="0" w:right="0" w:firstLine="0"/>
-              <w:jc w:val="left"/>
-              <w:rPr>
-                <w:rFonts w:ascii="Times New Roman" w:cs="Times New Roman" w:eastAsia="Times New Roman" w:hAnsi="Times New Roman"/>
-                <w:sz w:val="24"/>
-                <w:szCs w:val="24"/>
-              </w:rPr>
-            </w:pPr>
-            <w:r>
-              <w:rPr>
-                <w:rtl w:val="0"/>
-              </w:rPr>
-            </w:r>
-          </w:p>
-        </w:tc>
-      </w:tr>
-      <w:tr>
-        <w:trPr>
-          <w:cantSplit w:val="0"/>
-          <w:trHeight w:val="636" w:hRule="atLeast"/>
-          <w:tblHeader w:val="0"/>
-        </w:trPr>
-        <w:tc>
-          <w:tcPr>
-            <w:gridSpan w:val="5"/>
-            <w:tcBorders>
-              <w:top w:color="000000" w:space="0" w:sz="8" w:val="single"/>
-              <w:left w:color="000000" w:space="0" w:sz="8" w:val="single"/>
-              <w:bottom w:color="000000" w:space="0" w:sz="8" w:val="single"/>
-              <w:right w:color="000000" w:space="0" w:sz="8" w:val="single"/>
-            </w:tcBorders>
-            <w:vAlign w:val="center"/>
-          </w:tcPr>
-          <w:p>
-            <w:pPr>
-              <w:spacing w:after="0" w:line="240" w:lineRule="auto"/>
-              <w:jc w:val="center"/>
-              <w:rPr>
-                <w:rFonts w:ascii="Times New Roman" w:cs="Times New Roman" w:eastAsia="Times New Roman" w:hAnsi="Times New Roman"/>
-                <w:sz w:val="24"/>
-                <w:szCs w:val="24"/>
-              </w:rPr>
-            </w:pPr>
-            <w:r>
-              <w:rPr>
-                <w:rFonts w:ascii="Bookman Old Style" w:cs="Bookman Old Style" w:eastAsia="Bookman Old Style" w:hAnsi="Bookman Old Style"/>
-                <w:sz w:val="24"/>
-                <w:szCs w:val="24"/>
-                <w:rtl w:val="0"/>
-              </w:rPr>
-              <w:t>Terbilang: nol rupiah</w:t>
-            </w:r>
-            <w:r>
-              <w:rPr>
-                <w:rtl w:val="0"/>
-              </w:rPr>
-            </w:r>
-          </w:p>
-        </w:tc>
-        <w:tc>
-          <w:tcPr>
-            <w:tcBorders>
-              <w:top w:color="000000" w:space="0" w:sz="8" w:val="single"/>
-              <w:left w:color="000000" w:space="0" w:sz="8" w:val="single"/>
-              <w:bottom w:color="000000" w:space="0" w:sz="8" w:val="single"/>
-              <w:right w:color="000000" w:space="0" w:sz="8" w:val="single"/>
-            </w:tcBorders>
-            <w:vAlign w:val="center"/>
-          </w:tcPr>
-          <w:p>
-            <w:pPr>
-              <w:spacing w:after="0" w:line="240" w:lineRule="auto"/>
-              <w:jc w:val="center"/>
-              <w:rPr>
-                <w:rFonts w:ascii="Times New Roman" w:cs="Times New Roman" w:eastAsia="Times New Roman" w:hAnsi="Times New Roman"/>
-                <w:sz w:val="24"/>
-                <w:szCs w:val="24"/>
-              </w:rPr>
-            </w:pPr>
-            <w:r>
-              <w:rPr>
-                <w:rFonts w:ascii="Bookman Old Style" w:cs="Bookman Old Style" w:eastAsia="Bookman Old Style" w:hAnsi="Bookman Old Style"/>
-                <w:sz w:val="24"/>
-                <w:szCs w:val="24"/>
-                <w:rtl w:val="0"/>
-              </w:rPr>
-              <w:t>Rp 0, 00</w:t>
-            </w:r>
-            <w:r>
-              <w:rPr>
-                <w:rtl w:val="0"/>
-              </w:rPr>
-            </w:r>
-          </w:p>
-        </w:tc>
-      </w:tr>
-    </w:tbl>
-    <w:p>
-      <w:pPr>
-        <w:spacing w:after="0" w:line="240" w:lineRule="auto"/>
-        <w:rPr>
-          <w:rFonts w:ascii="Times New Roman" w:cs="Times New Roman" w:eastAsia="Times New Roman" w:hAnsi="Times New Roman"/>
-          <w:sz w:val="24"/>
-          <w:szCs w:val="24"/>
-        </w:rPr>
-      </w:pPr>
-      <w:r>
-        <w:rPr>
-          <w:rtl w:val="0"/>
-        </w:rPr>
-      </w:r>
-    </w:p>
-    <w:p>
-      <w:pPr>
-        <w:spacing w:after="0" w:line="240" w:lineRule="auto"/>
-        <w:rPr>
-          <w:rFonts w:ascii="Times New Roman" w:cs="Times New Roman" w:eastAsia="Times New Roman" w:hAnsi="Times New Roman"/>
-          <w:sz w:val="24"/>
-          <w:szCs w:val="24"/>
-        </w:rPr>
-      </w:pPr>
-      <w:r>
-        <w:rPr>
-          <w:rtl w:val="0"/>
-        </w:rPr>
-      </w:r>
-    </w:p>
-    <w:p>
-      <w:pPr>
-        <w:spacing w:after="0" w:line="240" w:lineRule="auto"/>
-        <w:rPr>
-          <w:rFonts w:ascii="Times New Roman" w:cs="Times New Roman" w:eastAsia="Times New Roman" w:hAnsi="Times New Roman"/>
-          <w:sz w:val="24"/>
-          <w:szCs w:val="24"/>
-        </w:rPr>
-      </w:pPr>
-      <w:r>
-        <w:rPr>
-          <w:rtl w:val="0"/>
-        </w:rPr>
-      </w:r>
-    </w:p>
-    <w:p>
-      <w:pPr>
-        <w:spacing w:after="0" w:line="240" w:lineRule="auto"/>
-        <w:rPr>
-          <w:rFonts w:ascii="Times New Roman" w:cs="Times New Roman" w:eastAsia="Times New Roman" w:hAnsi="Times New Roman"/>
-          <w:sz w:val="24"/>
-          <w:szCs w:val="24"/>
-        </w:rPr>
-      </w:pPr>
-      <w:r>
-        <w:rPr>
-          <w:rtl w:val="0"/>
-        </w:rPr>
-      </w:r>
-    </w:p>
-    <w:p>
-      <w:pPr>
-        <w:spacing w:after="0" w:line="240" w:lineRule="auto"/>
-        <w:rPr>
-          <w:rFonts w:ascii="Times New Roman" w:cs="Times New Roman" w:eastAsia="Times New Roman" w:hAnsi="Times New Roman"/>
-          <w:sz w:val="24"/>
-          <w:szCs w:val="24"/>
-        </w:rPr>
-      </w:pPr>
-      <w:r>
-        <w:rPr>
-          <w:rtl w:val="0"/>
-        </w:rPr>
-      </w:r>
-    </w:p>
-    <w:p>
-      <w:pPr>
-        <w:spacing w:after="0" w:line="240" w:lineRule="auto"/>
-        <w:rPr>
-          <w:rFonts w:ascii="Times New Roman" w:cs="Times New Roman" w:eastAsia="Times New Roman" w:hAnsi="Times New Roman"/>
-          <w:sz w:val="24"/>
-          <w:szCs w:val="24"/>
-        </w:rPr>
-      </w:pPr>
-      <w:r>
-        <w:rPr>
-          <w:rtl w:val="0"/>
-        </w:rPr>
-      </w:r>
-    </w:p>
-    <w:p>
-      <w:pPr>
-        <w:spacing w:after="0" w:line="240" w:lineRule="auto"/>
-        <w:rPr>
-          <w:rFonts w:ascii="Times New Roman" w:cs="Times New Roman" w:eastAsia="Times New Roman" w:hAnsi="Times New Roman"/>
-          <w:sz w:val="24"/>
-          <w:szCs w:val="24"/>
-        </w:rPr>
-      </w:pPr>
-      <w:r>
-        <w:rPr>
-          <w:rtl w:val="0"/>
-        </w:rPr>
-      </w:r>
-    </w:p>
-    <w:p>
-      <w:pPr>
-        <w:spacing w:after="0" w:line="240" w:lineRule="auto"/>
-        <w:rPr>
-          <w:rFonts w:ascii="Times New Roman" w:cs="Times New Roman" w:eastAsia="Times New Roman" w:hAnsi="Times New Roman"/>
-          <w:sz w:val="24"/>
-          <w:szCs w:val="24"/>
-        </w:rPr>
-      </w:pPr>
-      <w:r>
-        <w:rPr>
-          <w:rtl w:val="0"/>
-        </w:rPr>
-      </w:r>
-    </w:p>
-    <w:p>
-      <w:pPr>
-        <w:spacing w:after="0" w:line="240" w:lineRule="auto"/>
-        <w:rPr>
-          <w:rFonts w:ascii="Times New Roman" w:cs="Times New Roman" w:eastAsia="Times New Roman" w:hAnsi="Times New Roman"/>
-          <w:sz w:val="24"/>
-          <w:szCs w:val="24"/>
-        </w:rPr>
-      </w:pPr>
-      <w:r>
-        <w:rPr>
-          <w:rtl w:val="0"/>
-        </w:rPr>
-      </w:r>
-    </w:p>
-    <w:p>
-      <w:pPr>
-        <w:spacing w:after="0" w:line="240" w:lineRule="auto"/>
-        <w:rPr>
-          <w:rFonts w:ascii="Times New Roman" w:cs="Times New Roman" w:eastAsia="Times New Roman" w:hAnsi="Times New Roman"/>
-          <w:sz w:val="24"/>
-          <w:szCs w:val="24"/>
-        </w:rPr>
-      </w:pPr>
-      <w:r>
-        <w:rPr>
-          <w:rtl w:val="0"/>
-        </w:rPr>
-      </w:r>
-    </w:p>
-    <w:p>
-      <w:pPr>
-        <w:spacing w:after="0" w:line="240" w:lineRule="auto"/>
-        <w:rPr>
-          <w:rFonts w:ascii="Times New Roman" w:cs="Times New Roman" w:eastAsia="Times New Roman" w:hAnsi="Times New Roman"/>
-          <w:sz w:val="24"/>
-          <w:szCs w:val="24"/>
-        </w:rPr>
-      </w:pPr>
-      <w:r>
-        <w:rPr>
-          <w:rtl w:val="0"/>
-        </w:rPr>
-      </w:r>
-    </w:p>
-    <w:p>
-      <w:pPr>
-        <w:spacing w:after="0" w:line="240" w:lineRule="auto"/>
-        <w:rPr>
-          <w:rFonts w:ascii="Times New Roman" w:cs="Times New Roman" w:eastAsia="Times New Roman" w:hAnsi="Times New Roman"/>
-          <w:sz w:val="24"/>
-          <w:szCs w:val="24"/>
-        </w:rPr>
-      </w:pPr>
-      <w:r>
-        <w:rPr>
-          <w:rtl w:val="0"/>
-        </w:rPr>
-      </w:r>
-    </w:p>
-    <w:p>
-      <w:pPr>
-        <w:spacing w:after="0" w:line="240" w:lineRule="auto"/>
-        <w:rPr>
-          <w:rFonts w:ascii="Times New Roman" w:cs="Times New Roman" w:eastAsia="Times New Roman" w:hAnsi="Times New Roman"/>
-          <w:sz w:val="24"/>
-          <w:szCs w:val="24"/>
-        </w:rPr>
-      </w:pPr>
-      <w:r>
-        <w:rPr>
-          <w:rtl w:val="0"/>
-        </w:rPr>
-      </w:r>
-    </w:p>
-    <w:p>
-      <w:pPr>
-        <w:spacing w:after="0" w:line="240" w:lineRule="auto"/>
-        <w:rPr>
-          <w:rFonts w:ascii="Times New Roman" w:cs="Times New Roman" w:eastAsia="Times New Roman" w:hAnsi="Times New Roman"/>
-          <w:sz w:val="24"/>
-          <w:szCs w:val="24"/>
-        </w:rPr>
-      </w:pPr>
-      <w:r>
-        <w:rPr>
-          <w:rtl w:val="0"/>
-        </w:rPr>
-      </w:r>
-    </w:p>
-    <w:p>
-      <w:pPr>
-        <w:spacing w:after="0" w:line="240" w:lineRule="auto"/>
-        <w:rPr>
-          <w:rFonts w:ascii="Times New Roman" w:cs="Times New Roman" w:eastAsia="Times New Roman" w:hAnsi="Times New Roman"/>
-          <w:sz w:val="24"/>
-          <w:szCs w:val="24"/>
-        </w:rPr>
-      </w:pPr>
-      <w:r>
-        <w:rPr>
-          <w:rtl w:val="0"/>
-        </w:rPr>
-      </w:r>
-    </w:p>
-    <w:p>
-      <w:pPr>
-        <w:spacing w:after="0" w:line="240" w:lineRule="auto"/>
-        <w:rPr>
-          <w:rFonts w:ascii="Times New Roman" w:cs="Times New Roman" w:eastAsia="Times New Roman" w:hAnsi="Times New Roman"/>
-          <w:sz w:val="24"/>
-          <w:szCs w:val="24"/>
-        </w:rPr>
-      </w:pPr>
-      <w:r>
-        <w:rPr>
-          <w:rtl w:val="0"/>
-        </w:rPr>
-      </w:r>
-    </w:p>
-    <w:p>
-      <w:pPr>
-        <w:spacing w:after="200" w:line="240" w:lineRule="auto"/>
-        <w:rPr>
-          <w:rFonts w:ascii="Times New Roman" w:cs="Times New Roman" w:eastAsia="Times New Roman" w:hAnsi="Times New Roman"/>
-          <w:sz w:val="24"/>
-          <w:szCs w:val="24"/>
-        </w:rPr>
-      </w:pPr>
-      <w:r>
-        <w:rPr>
-          <w:rFonts w:ascii="Bookman Old Style" w:cs="Bookman Old Style" w:eastAsia="Bookman Old Style" w:hAnsi="Bookman Old Style"/>
-          <w:color w:val="000000"/>
-          <w:sz w:val="24"/>
-          <w:szCs w:val="24"/>
-          <w:rtl w:val="0"/>
-        </w:rPr>
-        <w:t xml:space="preserve">II. BUKTI PENCAPAIAN PEKERJAAN</w:t>
-      </w:r>
-      <w:r>
-        <w:rPr>
-          <w:rtl w:val="0"/>
-        </w:rPr>
-      </w:r>
-    </w:p>
-    <w:p>
-      <w:pPr>
-        <w:spacing w:after="0" w:line="240" w:lineRule="auto"/>
-        <w:ind w:left="360" w:firstLine="0"/>
-        <w:rPr>
-          <w:rFonts w:ascii="Bookman Old Style" w:cs="Bookman Old Style" w:eastAsia="Bookman Old Style" w:hAnsi="Bookman Old Style"/>
-          <w:color w:val="000000"/>
-          <w:sz w:val="24"/>
-          <w:szCs w:val="24"/>
-        </w:rPr>
-      </w:pPr>
-      <w:r>
-        <w:rPr>
-          <w:rFonts w:ascii="Bookman Old Style" w:cs="Bookman Old Style" w:eastAsia="Bookman Old Style" w:hAnsi="Bookman Old Style"/>
-          <w:color w:val="000000"/>
-          <w:sz w:val="24"/>
-          <w:szCs w:val="24"/>
-          <w:rtl w:val="0"/>
-        </w:rPr>
-        <w:t xml:space="preserve">Screenshoot Aplikasi Fasih</w:t>
-      </w:r>
-    </w:p>
-    <w:p>
-      <w:pPr>
-        <w:widowControl w:val="0"/>
-        <w:spacing w:after="0" w:line="240" w:lineRule="auto"/>
-        <w:ind w:left="360" w:firstLine="0"/>
-        <w:rPr>
-          <w:rFonts w:ascii="Bookman Old Style" w:cs="Bookman Old Style" w:eastAsia="Bookman Old Style" w:hAnsi="Bookman Old Style"/>
-          <w:sz w:val="24"/>
-          <w:szCs w:val="24"/>
-        </w:rPr>
-      </w:pPr>
-      <w:r>
-        <w:rPr>
-          <w:rtl w:val="0"/>
-        </w:rPr>
-      </w:r>
-    </w:p>
-    <w:sdt>
-      <w:sdtPr>
-        <w:lock w:val="contentLocked"/>
-        <w:id w:val="1540764095"/>
-        <w:tag w:val="goog_rdk_0"/>
-      </w:sdtPr>
-      <w:sdtContent>
-        <w:tbl>
-          <w:tblPr>
-            <w:tblStyle w:val="Table5"/>
-            <w:tblW w:w="14400.0" w:type="dxa"/>
-            <w:jc w:val="left"/>
-            <w:tblBorders>
-              <w:top w:color="000000" w:space="0" w:sz="4" w:val="single"/>
-              <w:left w:color="000000" w:space="0" w:sz="4" w:val="single"/>
-              <w:bottom w:color="000000" w:space="0" w:sz="4" w:val="single"/>
-              <w:right w:color="000000" w:space="0" w:sz="4" w:val="single"/>
-              <w:insideH w:color="000000" w:space="0" w:sz="4" w:val="single"/>
-              <w:insideV w:color="000000" w:space="0" w:sz="4" w:val="single"/>
-            </w:tblBorders>
-            <w:tblLayout w:type="fixed"/>
-            <w:tblLook w:val="0400"/>
-          </w:tblPr>
-          <w:tblGrid>
-            <w:gridCol w:w="6640"/>
-            <w:gridCol w:w="7760"/>
-            <w:tblGridChange w:id="0">
-              <w:tblGrid>
-                <w:gridCol w:w="6640"/>
-                <w:gridCol w:w="7760"/>
-              </w:tblGrid>
-            </w:tblGridChange>
-          </w:tblGrid>
-          <w:tr>
-            <w:trPr>
-              <w:cantSplit w:val="0"/>
-              <w:trHeight w:val="1291" w:hRule="atLeast"/>
-              <w:tblHeader w:val="0"/>
-            </w:trPr>
-            <w:tc>
-              <w:tcPr>
-                <w:tcBorders>
-                  <w:top w:color="000000" w:space="0" w:sz="0" w:val="nil"/>
-                  <w:left w:color="000000" w:space="0" w:sz="0" w:val="nil"/>
-                  <w:bottom w:color="000000" w:space="0" w:sz="0" w:val="nil"/>
-                  <w:right w:color="000000" w:space="0" w:sz="0" w:val="nil"/>
-                </w:tcBorders>
-              </w:tcPr>
-              <w:p>
-                <w:pPr>
-                  <w:widowControl w:val="0"/>
-                  <w:spacing w:after="0" w:line="240" w:lineRule="auto"/>
-                  <w:jc w:val="center"/>
-                  <w:rPr>
-                    <w:rFonts w:ascii="Bookman Old Style" w:cs="Bookman Old Style" w:eastAsia="Bookman Old Style" w:hAnsi="Bookman Old Style"/>
-                    <w:sz w:val="24"/>
-                    <w:szCs w:val="24"/>
-                  </w:rPr>
-                </w:pPr>
-                <w:r>
-                  <w:rPr>
-                    <w:rtl w:val="0"/>
-                  </w:rPr>
-                </w:r>
-              </w:p>
-              <w:p>
-                <w:pPr>
-                  <w:widowControl w:val="0"/>
-                  <w:spacing w:after="0" w:line="240" w:lineRule="auto"/>
-                  <w:jc w:val="center"/>
-                  <w:rPr>
-                    <w:rFonts w:ascii="Bookman Old Style" w:cs="Bookman Old Style" w:eastAsia="Bookman Old Style" w:hAnsi="Bookman Old Style"/>
-                    <w:sz w:val="24"/>
-                    <w:szCs w:val="24"/>
-                  </w:rPr>
-                </w:pPr>
-                <w:r>
-                  <w:rPr>
-                    <w:rtl w:val="0"/>
-                  </w:rPr>
-                </w:r>
-              </w:p>
-              <w:p>
-                <w:pPr>
-                  <w:widowControl w:val="0"/>
-                  <w:spacing w:after="0" w:line="240" w:lineRule="auto"/>
-                  <w:jc w:val="center"/>
-                  <w:rPr>
-                    <w:rFonts w:ascii="Bookman Old Style" w:cs="Bookman Old Style" w:eastAsia="Bookman Old Style" w:hAnsi="Bookman Old Style"/>
-                    <w:sz w:val="24"/>
-                    <w:szCs w:val="24"/>
-                  </w:rPr>
-                </w:pPr>
-                <w:r>
-                  <w:rPr>
-                    <w:rFonts w:ascii="Bookman Old Style" w:cs="Bookman Old Style" w:eastAsia="Bookman Old Style" w:hAnsi="Bookman Old Style"/>
-                    <w:sz w:val="24"/>
-                    <w:szCs w:val="24"/>
-                    <w:rtl w:val="0"/>
-                  </w:rPr>
-                  <w:t xml:space="preserve">PIHAK KEDUA,</w:t>
-                </w:r>
-              </w:p>
-              <w:p>
-                <w:pPr>
-                  <w:widowControl w:val="0"/>
-                  <w:spacing w:after="0" w:line="240" w:lineRule="auto"/>
-                  <w:rPr>
-                    <w:rFonts w:ascii="Bookman Old Style" w:cs="Bookman Old Style" w:eastAsia="Bookman Old Style" w:hAnsi="Bookman Old Style"/>
-                    <w:sz w:val="24"/>
-                    <w:szCs w:val="24"/>
-                  </w:rPr>
-                </w:pPr>
-                <w:r>
-                  <w:rPr>
-                    <w:rtl w:val="0"/>
-                  </w:rPr>
-                </w:r>
-              </w:p>
-              <w:p>
-                <w:pPr>
-                  <w:widowControl w:val="0"/>
-                  <w:spacing w:after="0" w:line="240" w:lineRule="auto"/>
-                  <w:jc w:val="center"/>
-                  <w:rPr>
-                    <w:rFonts w:ascii="Bookman Old Style" w:cs="Bookman Old Style" w:eastAsia="Bookman Old Style" w:hAnsi="Bookman Old Style"/>
-                    <w:sz w:val="24"/>
-                    <w:szCs w:val="24"/>
-                  </w:rPr>
-                </w:pPr>
-                <w:r>
-                  <w:rPr>
-                    <w:rtl w:val="0"/>
-                  </w:rPr>
-                </w:r>
-              </w:p>
-              <w:p>
-                <w:pPr>
-                  <w:widowControl w:val="0"/>
-                  <w:spacing w:after="0" w:line="240" w:lineRule="auto"/>
-                  <w:jc w:val="center"/>
-                  <w:rPr>
-                    <w:rFonts w:ascii="Bookman Old Style" w:cs="Bookman Old Style" w:eastAsia="Bookman Old Style" w:hAnsi="Bookman Old Style"/>
-                    <w:sz w:val="24"/>
-                    <w:szCs w:val="24"/>
-                  </w:rPr>
-                </w:pPr>
-                <w:r>
-                  <w:rPr>
-                    <w:rFonts w:ascii="Bookman Old Style" w:cs="Bookman Old Style" w:eastAsia="Bookman Old Style" w:hAnsi="Bookman Old Style"/>
-                    <w:sz w:val="24"/>
-                    <w:szCs w:val="24"/>
-                    <w:rtl w:val="0"/>
-                  </w:rPr>
-                  <w:t xml:space="preserve">(.........................................)</w:t>
-                </w:r>
-              </w:p>
-            </w:tc>
-            <w:tc>
-              <w:tcPr>
-                <w:tcBorders>
-                  <w:top w:color="000000" w:space="0" w:sz="0" w:val="nil"/>
-                  <w:left w:color="000000" w:space="0" w:sz="0" w:val="nil"/>
-                  <w:bottom w:color="000000" w:space="0" w:sz="0" w:val="nil"/>
-                  <w:right w:color="000000" w:space="0" w:sz="0" w:val="nil"/>
-                </w:tcBorders>
-              </w:tcPr>
-              <w:p>
-                <w:pPr>
-                  <w:widowControl w:val="0"/>
-                  <w:spacing w:after="0" w:line="240" w:lineRule="auto"/>
-                  <w:jc w:val="center"/>
-                  <w:rPr>
-                    <w:rFonts w:ascii="Bookman Old Style" w:cs="Bookman Old Style" w:eastAsia="Bookman Old Style" w:hAnsi="Bookman Old Style"/>
-                    <w:sz w:val="24"/>
-                    <w:szCs w:val="24"/>
-                  </w:rPr>
-                </w:pPr>
-                <w:r>
-                  <w:rPr>
-                    <w:rtl w:val="0"/>
-                  </w:rPr>
-                </w:r>
-              </w:p>
-              <w:p>
-                <w:pPr>
-                  <w:widowControl w:val="0"/>
-                  <w:spacing w:after="0" w:line="240" w:lineRule="auto"/>
-                  <w:jc w:val="center"/>
-                  <w:rPr>
-                    <w:rFonts w:ascii="Bookman Old Style" w:cs="Bookman Old Style" w:eastAsia="Bookman Old Style" w:hAnsi="Bookman Old Style"/>
-                    <w:sz w:val="24"/>
-                    <w:szCs w:val="24"/>
-                  </w:rPr>
-                </w:pPr>
-                <w:r>
-                  <w:rPr>
-                    <w:rtl w:val="0"/>
-                  </w:rPr>
-                </w:r>
-              </w:p>
-              <w:p>
-                <w:pPr>
-                  <w:widowControl w:val="0"/>
-                  <w:spacing w:after="0" w:line="240" w:lineRule="auto"/>
-                  <w:jc w:val="center"/>
-                  <w:rPr>
-                    <w:rFonts w:ascii="Bookman Old Style" w:cs="Bookman Old Style" w:eastAsia="Bookman Old Style" w:hAnsi="Bookman Old Style"/>
-                    <w:sz w:val="24"/>
-                    <w:szCs w:val="24"/>
-                  </w:rPr>
-                </w:pPr>
-                <w:r>
-                  <w:rPr>
-                    <w:rFonts w:ascii="Bookman Old Style" w:cs="Bookman Old Style" w:eastAsia="Bookman Old Style" w:hAnsi="Bookman Old Style"/>
-                    <w:sz w:val="24"/>
-                    <w:szCs w:val="24"/>
-                    <w:rtl w:val="0"/>
-                  </w:rPr>
-                  <w:t xml:space="preserve">PIHAK PERTAMA,</w:t>
-                </w:r>
-              </w:p>
-              <w:p>
-                <w:pPr>
-                  <w:widowControl w:val="0"/>
-                  <w:spacing w:after="0" w:line="240" w:lineRule="auto"/>
-                  <w:rPr>
-                    <w:rFonts w:ascii="Bookman Old Style" w:cs="Bookman Old Style" w:eastAsia="Bookman Old Style" w:hAnsi="Bookman Old Style"/>
-                    <w:sz w:val="24"/>
-                    <w:szCs w:val="24"/>
-                  </w:rPr>
-                </w:pPr>
-                <w:r>
-                  <w:rPr>
-                    <w:rtl w:val="0"/>
-                  </w:rPr>
-                </w:r>
-              </w:p>
-              <w:p>
-                <w:pPr>
-                  <w:widowControl w:val="0"/>
-                  <w:spacing w:after="0" w:line="240" w:lineRule="auto"/>
-                  <w:jc w:val="center"/>
-                  <w:rPr>
-                    <w:rFonts w:ascii="Bookman Old Style" w:cs="Bookman Old Style" w:eastAsia="Bookman Old Style" w:hAnsi="Bookman Old Style"/>
-                    <w:sz w:val="24"/>
-                    <w:szCs w:val="24"/>
-                  </w:rPr>
-                </w:pPr>
-                <w:r>
-                  <w:rPr>
-                    <w:rtl w:val="0"/>
-                  </w:rPr>
-                </w:r>
-              </w:p>
-              <w:p>
-                <w:pPr>
-                  <w:widowControl w:val="0"/>
-                  <w:spacing w:after="0" w:line="240" w:lineRule="auto"/>
-                  <w:jc w:val="center"/>
-                  <w:rPr>
-                    <w:rFonts w:ascii="Bookman Old Style" w:cs="Bookman Old Style" w:eastAsia="Bookman Old Style" w:hAnsi="Bookman Old Style"/>
-                    <w:sz w:val="24"/>
-                    <w:szCs w:val="24"/>
-                  </w:rPr>
-                </w:pPr>
-                <w:r>
-                  <w:rPr>
-                    <w:rFonts w:ascii="Bookman Old Style" w:cs="Bookman Old Style" w:eastAsia="Bookman Old Style" w:hAnsi="Bookman Old Style"/>
-                    <w:sz w:val="24"/>
-                    <w:szCs w:val="24"/>
-                    <w:rtl w:val="0"/>
-                  </w:rPr>
-                  <w:t xml:space="preserve">(.........................................)</w:t>
-                </w:r>
-              </w:p>
-            </w:tc>
-          </w:tr>
-        </w:tbl>
-      </w:sdtContent>
-    </w:sdt>
-    <w:p>
-      <w:pPr>
-        <w:widowControl w:val="0"/>
-        <w:spacing w:after="0" w:line="240" w:lineRule="auto"/>
-        <w:rPr>
-          <w:rFonts w:ascii="Bookman Old Style" w:cs="Bookman Old Style" w:eastAsia="Bookman Old Style" w:hAnsi="Bookman Old Style"/>
-          <w:sz w:val="24"/>
-          <w:szCs w:val="24"/>
-        </w:rPr>
-      </w:pPr>
-      <w:r>
-        <w:rPr>
-          <w:rtl w:val="0"/>
-        </w:rPr>
-      </w:r>
-    </w:p>
-    <w:p>
-      <w:pPr>
-        <w:widowControl w:val="0"/>
-        <w:spacing w:after="0" w:line="240" w:lineRule="auto"/>
-        <w:rPr>
-          <w:rFonts w:ascii="Bookman Old Style" w:cs="Bookman Old Style" w:eastAsia="Bookman Old Style" w:hAnsi="Bookman Old Style"/>
-          <w:sz w:val="24"/>
-          <w:szCs w:val="24"/>
-        </w:rPr>
-      </w:pPr>
-      <w:r>
-        <w:rPr>
-          <w:rtl w:val="0"/>
-        </w:rPr>
-      </w:r>
-    </w:p>
-    <w:p>
-      <w:pPr>
-        <w:widowControl w:val="0"/>
-        <w:spacing w:after="0" w:line="240" w:lineRule="auto"/>
-        <w:rPr>
-          <w:rFonts w:ascii="Bookman Old Style" w:cs="Bookman Old Style" w:eastAsia="Bookman Old Style" w:hAnsi="Bookman Old Style"/>
-          <w:sz w:val="24"/>
-          <w:szCs w:val="24"/>
-        </w:rPr>
-      </w:pPr>
-      <w:r>
-        <w:rPr>
-          <w:rtl w:val="0"/>
-        </w:rPr>
-      </w:r>
-    </w:p>
-    <w:p>
-      <w:pPr>
-        <w:widowControl w:val="0"/>
-        <w:spacing w:after="0" w:line="240" w:lineRule="auto"/>
-        <w:rPr>
-          <w:rFonts w:ascii="Bookman Old Style" w:cs="Bookman Old Style" w:eastAsia="Bookman Old Style" w:hAnsi="Bookman Old Style"/>
-          <w:sz w:val="24"/>
-          <w:szCs w:val="24"/>
-        </w:rPr>
-      </w:pPr>
-      <w:r>
-        <w:rPr>
-          <w:rtl w:val="0"/>
-        </w:rPr>
-      </w:r>
-    </w:p>
-    <w:p>
-      <w:pPr>
-        <w:widowControl w:val="0"/>
-        <w:spacing w:after="0" w:line="240" w:lineRule="auto"/>
-        <w:rPr>
-          <w:rFonts w:ascii="Bookman Old Style" w:cs="Bookman Old Style" w:eastAsia="Bookman Old Style" w:hAnsi="Bookman Old Style"/>
-          <w:sz w:val="24"/>
-          <w:szCs w:val="24"/>
-        </w:rPr>
-      </w:pPr>
-      <w:r>
-        <w:rPr>
-          <w:rtl w:val="0"/>
-        </w:rPr>
-      </w:r>
-    </w:p>
-    <w:p>
-      <w:pPr>
-        <w:widowControl w:val="0"/>
-        <w:spacing w:after="0" w:line="240" w:lineRule="auto"/>
-        <w:jc w:val="center"/>
-        <w:rPr>
-          <w:rFonts w:ascii="Bookman Old Style" w:cs="Bookman Old Style" w:eastAsia="Bookman Old Style" w:hAnsi="Bookman Old Style"/>
-          <w:sz w:val="24"/>
-          <w:szCs w:val="24"/>
-        </w:rPr>
-      </w:pPr>
-      <w:r>
-        <w:rPr>
-          <w:rtl w:val="0"/>
-        </w:rPr>
-      </w:r>
-    </w:p>
-    <w:p>
-      <w:pPr>
-        <w:widowControl w:val="0"/>
-        <w:spacing w:after="0" w:line="240" w:lineRule="auto"/>
-        <w:jc w:val="center"/>
-        <w:rPr>
-          <w:rFonts w:ascii="Bookman Old Style" w:cs="Bookman Old Style" w:eastAsia="Bookman Old Style" w:hAnsi="Bookman Old Style"/>
-          <w:sz w:val="24"/>
-          <w:szCs w:val="24"/>
-        </w:rPr>
-      </w:pPr>
-      <w:r>
-        <w:rPr>
-          <w:rFonts w:ascii="Bookman Old Style" w:cs="Bookman Old Style" w:eastAsia="Bookman Old Style" w:hAnsi="Bookman Old Style"/>
-          <w:sz w:val="24"/>
-          <w:szCs w:val="24"/>
-          <w:rtl w:val="0"/>
-        </w:rPr>
-        <w:t xml:space="preserve">Menyetujui,</w:t>
-        <w:br w:type="textWrapping"/>
-        <w:t xml:space="preserve">Pejabat Pembuat Komitmen</w:t>
-      </w:r>
-    </w:p>
-    <w:p>
-      <w:pPr>
-        <w:widowControl w:val="0"/>
-        <w:spacing w:after="0" w:line="240" w:lineRule="auto"/>
-        <w:rPr>
-          <w:rFonts w:ascii="Bookman Old Style" w:cs="Bookman Old Style" w:eastAsia="Bookman Old Style" w:hAnsi="Bookman Old Style"/>
-          <w:sz w:val="24"/>
-          <w:szCs w:val="24"/>
-        </w:rPr>
-      </w:pPr>
-      <w:r>
-        <w:rPr>
-          <w:rtl w:val="0"/>
-        </w:rPr>
-      </w:r>
-    </w:p>
-    <w:p>
-      <w:pPr>
-        <w:widowControl w:val="0"/>
-        <w:spacing w:after="0" w:line="240" w:lineRule="auto"/>
-        <w:jc w:val="center"/>
-        <w:rPr>
-          <w:rFonts w:ascii="Bookman Old Style" w:cs="Bookman Old Style" w:eastAsia="Bookman Old Style" w:hAnsi="Bookman Old Style"/>
-          <w:sz w:val="24"/>
-          <w:szCs w:val="24"/>
-        </w:rPr>
-      </w:pPr>
-      <w:r>
-        <w:rPr>
-          <w:rtl w:val="0"/>
-        </w:rPr>
-      </w:r>
-    </w:p>
-    <w:p>
-      <w:pPr>
-        <w:widowControl w:val="0"/>
-        <w:spacing w:after="0" w:line="240" w:lineRule="auto"/>
-        <w:jc w:val="center"/>
-        <w:rPr>
-          <w:rFonts w:ascii="Bookman Old Style" w:cs="Bookman Old Style" w:eastAsia="Bookman Old Style" w:hAnsi="Bookman Old Style"/>
-          <w:sz w:val="24"/>
-          <w:szCs w:val="24"/>
-        </w:rPr>
-      </w:pPr>
-      <w:r>
-        <w:rPr>
-          <w:rFonts w:ascii="Bookman Old Style" w:cs="Bookman Old Style" w:eastAsia="Bookman Old Style" w:hAnsi="Bookman Old Style"/>
-          <w:sz w:val="24"/>
-          <w:szCs w:val="24"/>
-          <w:rtl w:val="0"/>
-        </w:rPr>
-        <w:t>${nama_ppk}</w:t>
-      </w:r>
-    </w:p>
-    <w:p>
-      <w:pPr>
-        <w:widowControl w:val="0"/>
-        <w:spacing w:after="0" w:line="240" w:lineRule="auto"/>
-        <w:rPr>
-          <w:rFonts w:ascii="Bookman Old Style" w:cs="Bookman Old Style" w:eastAsia="Bookman Old Style" w:hAnsi="Bookman Old Style"/>
-          <w:sz w:val="24"/>
-          <w:szCs w:val="24"/>
-        </w:rPr>
-      </w:pPr>
-      <w:r>
-        <w:rPr>
-          <w:rtl w:val="0"/>
-        </w:rPr>
-      </w:r>
-    </w:p>
-    <w:p>
-      <w:pPr>
-        <w:widowControl w:val="0"/>
-        <w:spacing w:after="0" w:line="240" w:lineRule="auto"/>
-        <w:rPr>
-          <w:rFonts w:ascii="Bookman Old Style" w:cs="Bookman Old Style" w:eastAsia="Bookman Old Style" w:hAnsi="Bookman Old Style"/>
-          <w:sz w:val="24"/>
-          <w:szCs w:val="24"/>
-        </w:rPr>
-      </w:pPr>
-      <w:r>
-        <w:rPr>
-          <w:rtl w:val="0"/>
-        </w:rPr>
-      </w:r>
-    </w:p>
-    <w:p>
-      <w:pPr>
-        <w:widowControl w:val="0"/>
-        <w:spacing w:after="0" w:line="240" w:lineRule="auto"/>
-        <w:rPr>
-          <w:rFonts w:ascii="Bookman Old Style" w:cs="Bookman Old Style" w:eastAsia="Bookman Old Style" w:hAnsi="Bookman Old Style"/>
-          <w:sz w:val="24"/>
-          <w:szCs w:val="24"/>
-        </w:rPr>
-      </w:pPr>
-      <w:r>
-        <w:rPr>
-          <w:rtl w:val="0"/>
-        </w:rPr>
-      </w:r>
-    </w:p>
-    <w:p>
-      <w:pPr>
-        <w:widowControl w:val="0"/>
-        <w:spacing w:after="0" w:line="240" w:lineRule="auto"/>
-        <w:rPr>
-          <w:rFonts w:ascii="Bookman Old Style" w:cs="Bookman Old Style" w:eastAsia="Bookman Old Style" w:hAnsi="Bookman Old Style"/>
-          <w:sz w:val="24"/>
-          <w:szCs w:val="24"/>
-        </w:rPr>
-      </w:pPr>
-      <w:r>
-        <w:rPr>
-          <w:rtl w:val="0"/>
-        </w:rPr>
-      </w:r>
-    </w:p>
-    <w:p>
-      <w:pPr>
-        <w:rPr/>
-      </w:pPr>
-      <w:r>
-        <w:rPr>
-          <w:rtl w:val="0"/>
-        </w:rPr>
       </w:r>
     </w:p>
     <w:sectPr>

</xml_diff>

<commit_message>
Fix BAPP II point 1/4 SLS figure: use realisasi_sls (termin 2 work), not target_sls
Corrects the previous fix which went the wrong direction - both narrative
sentences should show the amount actually worked on in termin 2
(realisasi_sls), not the total assigned SLS count (target_sls). The
lampiran table's "Target Pekerjaan / Volume" column still correctly shows
target_sls.

Co-Authored-By: Claude Sonnet 5 <noreply@anthropic.com>
</commit_message>
<xml_diff>
--- a/static/templates-se2026/bapp_termin2_pcl_se2026.docx
+++ b/static/templates-se2026/bapp_termin2_pcl_se2026.docx
@@ -652,7 +652,7 @@
           <w:szCs w:val="24"/>
           <w:rtl w:val="0"/>
         </w:rPr>
-        <w:t>I yang ditetapkan sebesar ${target_sls} SLS/Sub-SLS dan/atau usaha besar</w:t>
+        <w:t>I yang ditetapkan sebesar ${realisasi_sls} SLS/Sub-SLS dan/atau usaha besar</w:t>
       </w:r>
       <w:r>
         <w:rPr>
@@ -829,7 +829,7 @@
           <w:szCs w:val="24"/>
           <w:rtl w:val="0"/>
         </w:rPr>
-        <w:t>Hasil pekerjaan Pendataan Lapangan Sensus Ekonomi 2026 sebagaimana dimaksud dalam angka 3, berupa dokumen hasil Pendataan Lapangan Sensus Ekonomi 2026, sejumlah ${target_sls} SLS/Sub-SLS dan/atau usaha besar</w:t>
+        <w:t>Hasil pekerjaan Pendataan Lapangan Sensus Ekonomi 2026 sebagaimana dimaksud dalam angka 3, berupa dokumen hasil Pendataan Lapangan Sensus Ekonomi 2026, sejumlah ${realisasi_sls} SLS/Sub-SLS dan/atau usaha besar</w:t>
       </w:r>
       <w:r>
         <w:rPr>

</xml_diff>

<commit_message>
Add more signature space above PPK (Emalia) name in BAPP II templates
The "Menyetujui, Pejabat Pembuat Komitmen" block at the end of BAPP II
(both PCL/PPL and PML variants) only had 2 blank lines before the PPK's
name, leaving no real room for a physical signature. Tripled the blank
paragraph block (2 -> 6 blank lines) matching the spacing already used for
the PIHAK KEDUA/PIHAK PERTAMA block earlier in the document. Verified via
PDF render: page count unchanged (still 4 pages), clear gap above the name
on both variants.

Co-Authored-By: Claude Sonnet 5 <noreply@anthropic.com>
</commit_message>
<xml_diff>
--- a/static/templates-se2026/bapp_termin2_pcl_se2026.docx
+++ b/static/templates-se2026/bapp_termin2_pcl_se2026.docx
@@ -3347,6 +3347,72 @@
         <w:t xml:space="preserve">Menyetujui,</w:t>
         <w:br w:type="textWrapping"/>
         <w:t xml:space="preserve">Pejabat Pembuat Komitmen</w:t>
+      </w:r>
+    </w:p>
+    <w:p>
+      <w:pPr>
+        <w:widowControl w:val="0"/>
+        <w:spacing w:after="0" w:line="240" w:lineRule="auto"/>
+        <w:rPr>
+          <w:rFonts w:ascii="Bookman Old Style" w:cs="Bookman Old Style" w:eastAsia="Bookman Old Style" w:hAnsi="Bookman Old Style"/>
+          <w:sz w:val="24"/>
+          <w:szCs w:val="24"/>
+        </w:rPr>
+      </w:pPr>
+      <w:r>
+        <w:rPr>
+          <w:rtl w:val="0"/>
+        </w:rPr>
+      </w:r>
+    </w:p>
+    <w:p>
+      <w:pPr>
+        <w:widowControl w:val="0"/>
+        <w:spacing w:after="0" w:line="240" w:lineRule="auto"/>
+        <w:jc w:val="center"/>
+        <w:rPr>
+          <w:rFonts w:ascii="Bookman Old Style" w:cs="Bookman Old Style" w:eastAsia="Bookman Old Style" w:hAnsi="Bookman Old Style"/>
+          <w:sz w:val="24"/>
+          <w:szCs w:val="24"/>
+        </w:rPr>
+      </w:pPr>
+      <w:r>
+        <w:rPr>
+          <w:rtl w:val="0"/>
+        </w:rPr>
+      </w:r>
+    </w:p>
+    <w:p>
+      <w:pPr>
+        <w:widowControl w:val="0"/>
+        <w:spacing w:after="0" w:line="240" w:lineRule="auto"/>
+        <w:rPr>
+          <w:rFonts w:ascii="Bookman Old Style" w:cs="Bookman Old Style" w:eastAsia="Bookman Old Style" w:hAnsi="Bookman Old Style"/>
+          <w:sz w:val="24"/>
+          <w:szCs w:val="24"/>
+        </w:rPr>
+      </w:pPr>
+      <w:r>
+        <w:rPr>
+          <w:rtl w:val="0"/>
+        </w:rPr>
+      </w:r>
+    </w:p>
+    <w:p>
+      <w:pPr>
+        <w:widowControl w:val="0"/>
+        <w:spacing w:after="0" w:line="240" w:lineRule="auto"/>
+        <w:jc w:val="center"/>
+        <w:rPr>
+          <w:rFonts w:ascii="Bookman Old Style" w:cs="Bookman Old Style" w:eastAsia="Bookman Old Style" w:hAnsi="Bookman Old Style"/>
+          <w:sz w:val="24"/>
+          <w:szCs w:val="24"/>
+        </w:rPr>
+      </w:pPr>
+      <w:r>
+        <w:rPr>
+          <w:rtl w:val="0"/>
+        </w:rPr>
       </w:r>
     </w:p>
     <w:p>

</xml_diff>